<commit_message>
checkpoint: before clarify integration task
</commit_message>
<xml_diff>
--- a/Docs/DisinfoJam_GDD.docx
+++ b/Docs/DisinfoJam_GDD.docx
@@ -11,65 +11,34 @@
       </w:r>
     </w:p>
     <w:p>
+      <w:r>
+        <w:t>План ближайшей версии • Предлагаемые приоритеты для команды</w:t>
+      </w:r>
+    </w:p>
+    <w:p>
+      <w:r>
+        <w:t>Цель: довести цикл «редакция → дом → следующий день» до состояния, когда интересно выбирать заголовки и понятно, к чему приводит выбор.</w:t>
+      </w:r>
+    </w:p>
+    <w:p>
       <w:pPr>
         <w:pStyle w:val="Heading1"/>
       </w:pPr>
       <w:r>
-        <w:t>Дизайн документ игры</w:t>
+        <w:t>Уже есть — используем как основу</w:t>
       </w:r>
     </w:p>
     <w:p>
       <w:r>
-        <w:t>Концепция прототипа и границы MVP • Версия 1.0 • 22 сентября 2026 года</w:t>
-      </w:r>
-    </w:p>
-    <w:p>
-      <w:r>
-        <w:t>Мы делаем компактную игру о редакторе газеты: игрок читает источники, выбирает заголовки под давлением времени и оплачивает собственное выживание. Наша ближайшая цель — довести существующий цикл редакции и дома до понятного, визуально цельного прототипа.</w:t>
-      </w:r>
-    </w:p>
-    <w:p>
-      <w:r>
-        <w:t>Этот документ задаёт направление, основные правила, стартовый баланс и разделение ответственности. Детальные задачи команда расписывает отдельно. План производства и распределение ролей ниже предложены для согласования.</w:t>
+        <w:t>32 материала; три заголовка на выбор; смена и лимит 10 публикаций; три шкалы и деньги; комбо; еда, кофе и сон; усталость; четыре концовки. Основные механики заново не проектируем.</w:t>
       </w:r>
     </w:p>
     <w:p>
       <w:pPr>
-        <w:pStyle w:val="Heading2"/>
+        <w:pStyle w:val="Heading1"/>
       </w:pPr>
       <w:r>
-        <w:t>Игровое обещание</w:t>
-      </w:r>
-    </w:p>
-    <w:p>
-      <w:r>
-        <w:t>Каждая публикация — выбор между заработком, доверием читателей и отношениями с государством. Деньги помогают продержаться, но ошибки и усталость могут закончить попытку. Правдивый заголовок способен навредить лояльности: точность и политическая выгода оцениваются отдельно.</w:t>
-      </w:r>
-    </w:p>
-    <w:p>
-      <w:pPr>
-        <w:pStyle w:val="Heading2"/>
-      </w:pPr>
-      <w:r>
-        <w:t>Аудитория и формат</w:t>
-      </w:r>
-    </w:p>
-    <w:p>
-      <w:r>
-        <w:t>Ориентируемся на русскоязычных подростков старшего возраста и взрослых, которым интересны короткие игры о неоднозначных решениях и сатира. Это ориентир для подачи, а не официальная возрастная маркировка. Тональность и допустимость грубой лексики команда согласует отдельно.</w:t>
-      </w:r>
-    </w:p>
-    <w:p>
-      <w:r>
-        <w:t>Один игрок; настольный ПК; Godot; мышь и клавиатура; Full HD. Редакция — рисованный стол с псевдообъёмом. Дом — пиксельная комната. Результат этапа — рабочий проект с цельным игровым циклом и заменой основных графических заглушек.</w:t>
-      </w:r>
-    </w:p>
-    <w:p>
-      <w:pPr>
-        <w:pStyle w:val="Heading2"/>
-      </w:pPr>
-      <w:r>
-        <w:t>Границы первой версии</w:t>
+        <w:t>Сейчас — довести до рабочего показа</w:t>
       </w:r>
     </w:p>
     <w:tbl>
@@ -88,8 +57,9 @@
         </w:tblBorders>
       </w:tblPr>
       <w:tblGrid>
-        <w:gridCol w:w="5083"/>
-        <w:gridCol w:w="5083"/>
+        <w:gridCol w:w="2448"/>
+        <w:gridCol w:w="5688"/>
+        <w:gridCol w:w="2232"/>
       </w:tblGrid>
       <w:tr>
         <w:trPr>
@@ -98,53 +68,76 @@
         </w:trPr>
         <w:tc>
           <w:tcPr>
-            <w:tcW w:type="dxa" w:w="5083"/>
+            <w:tcW w:type="dxa" w:w="2448"/>
             <w:vAlign w:val="center"/>
-            <w:shd w:fill="243B48"/>
+            <w:shd w:fill="DDE7ED"/>
             <w:tcMar>
-              <w:top w:w="85" w:type="dxa"/>
-              <w:left w:w="85" w:type="dxa"/>
-              <w:bottom w:w="85" w:type="dxa"/>
-              <w:right w:w="85" w:type="dxa"/>
+              <w:top w:w="70" w:type="dxa"/>
+              <w:left w:w="70" w:type="dxa"/>
+              <w:bottom w:w="70" w:type="dxa"/>
+              <w:right w:w="70" w:type="dxa"/>
             </w:tcMar>
           </w:tcPr>
           <w:p>
             <w:pPr>
-              <w:spacing w:after="0" w:line="247" w:lineRule="auto"/>
+              <w:spacing w:after="0"/>
             </w:pPr>
             <w:r>
               <w:rPr>
                 <w:b/>
-                <w:color w:val="FFFFFF"/>
                 <w:sz w:val="21"/>
               </w:rPr>
-              <w:t>Включаем в MVP</w:t>
+              <w:t>Задача</w:t>
             </w:r>
           </w:p>
         </w:tc>
         <w:tc>
           <w:tcPr>
-            <w:tcW w:type="dxa" w:w="5083"/>
+            <w:tcW w:type="dxa" w:w="5688"/>
             <w:vAlign w:val="center"/>
-            <w:shd w:fill="243B48"/>
+            <w:shd w:fill="DDE7ED"/>
             <w:tcMar>
-              <w:top w:w="85" w:type="dxa"/>
-              <w:left w:w="85" w:type="dxa"/>
-              <w:bottom w:w="85" w:type="dxa"/>
-              <w:right w:w="85" w:type="dxa"/>
+              <w:top w:w="70" w:type="dxa"/>
+              <w:left w:w="70" w:type="dxa"/>
+              <w:bottom w:w="70" w:type="dxa"/>
+              <w:right w:w="70" w:type="dxa"/>
             </w:tcMar>
           </w:tcPr>
           <w:p>
             <w:pPr>
-              <w:spacing w:after="0" w:line="247" w:lineRule="auto"/>
+              <w:spacing w:after="0"/>
             </w:pPr>
             <w:r>
               <w:rPr>
                 <w:b/>
-                <w:color w:val="FFFFFF"/>
                 <w:sz w:val="21"/>
               </w:rPr>
-              <w:t>Откладываем</w:t>
+              <w:t>Что должно получиться</w:t>
+            </w:r>
+          </w:p>
+        </w:tc>
+        <w:tc>
+          <w:tcPr>
+            <w:tcW w:type="dxa" w:w="2232"/>
+            <w:vAlign w:val="center"/>
+            <w:shd w:fill="DDE7ED"/>
+            <w:tcMar>
+              <w:top w:w="70" w:type="dxa"/>
+              <w:left w:w="70" w:type="dxa"/>
+              <w:bottom w:w="70" w:type="dxa"/>
+              <w:right w:w="70" w:type="dxa"/>
+            </w:tcMar>
+          </w:tcPr>
+          <w:p>
+            <w:pPr>
+              <w:spacing w:after="0"/>
+            </w:pPr>
+            <w:r>
+              <w:rPr>
+                <w:b/>
+                <w:sz w:val="21"/>
+              </w:rPr>
+              <w:t>Кто ведёт</w:t>
             </w:r>
           </w:p>
         </w:tc>
@@ -155,49 +148,76 @@
         </w:trPr>
         <w:tc>
           <w:tcPr>
-            <w:tcW w:type="dxa" w:w="5083"/>
+            <w:tcW w:type="dxa" w:w="2448"/>
             <w:vAlign w:val="center"/>
-            <w:shd w:fill="F2F5F7"/>
+            <w:shd w:fill="FFFFFF"/>
             <w:tcMar>
-              <w:top w:w="85" w:type="dxa"/>
-              <w:left w:w="85" w:type="dxa"/>
-              <w:bottom w:w="85" w:type="dxa"/>
-              <w:right w:w="85" w:type="dxa"/>
+              <w:top w:w="70" w:type="dxa"/>
+              <w:left w:w="70" w:type="dxa"/>
+              <w:bottom w:w="70" w:type="dxa"/>
+              <w:right w:w="70" w:type="dxa"/>
             </w:tcMar>
           </w:tcPr>
           <w:p>
             <w:pPr>
-              <w:spacing w:after="0" w:line="247" w:lineRule="auto"/>
+              <w:spacing w:after="0"/>
             </w:pPr>
             <w:r>
               <w:rPr>
+                <w:b w:val="0"/>
                 <w:sz w:val="21"/>
               </w:rPr>
-              <w:t>Две локации, короткий пролог и обучение, четыре концовки проигрыша.</w:t>
+              <w:t>Понятный интерфейс</w:t>
             </w:r>
           </w:p>
         </w:tc>
         <w:tc>
           <w:tcPr>
-            <w:tcW w:type="dxa" w:w="5083"/>
+            <w:tcW w:type="dxa" w:w="5688"/>
             <w:vAlign w:val="center"/>
-            <w:shd w:fill="F2F5F7"/>
+            <w:shd w:fill="FFFFFF"/>
             <w:tcMar>
-              <w:top w:w="85" w:type="dxa"/>
-              <w:left w:w="85" w:type="dxa"/>
-              <w:bottom w:w="85" w:type="dxa"/>
-              <w:right w:w="85" w:type="dxa"/>
+              <w:top w:w="70" w:type="dxa"/>
+              <w:left w:w="70" w:type="dxa"/>
+              <w:bottom w:w="70" w:type="dxa"/>
+              <w:right w:w="70" w:type="dxa"/>
             </w:tcMar>
           </w:tcPr>
           <w:p>
             <w:pPr>
-              <w:spacing w:after="0" w:line="247" w:lineRule="auto"/>
+              <w:spacing w:after="0"/>
             </w:pPr>
             <w:r>
               <w:rPr>
+                <w:b w:val="0"/>
                 <w:sz w:val="21"/>
               </w:rPr>
-              <w:t>Полноценное 3D, свободное перемещение, озвученные катсцены и ветвящуюся новеллу.</w:t>
+              <w:t>Источник легко найти; заголовки читаются; подтверждение, последствия, цены и лимит выпуска понятны без объяснений.</w:t>
+            </w:r>
+          </w:p>
+        </w:tc>
+        <w:tc>
+          <w:tcPr>
+            <w:tcW w:type="dxa" w:w="2232"/>
+            <w:vAlign w:val="center"/>
+            <w:shd w:fill="FFFFFF"/>
+            <w:tcMar>
+              <w:top w:w="70" w:type="dxa"/>
+              <w:left w:w="70" w:type="dxa"/>
+              <w:bottom w:w="70" w:type="dxa"/>
+              <w:right w:w="70" w:type="dxa"/>
+            </w:tcMar>
+          </w:tcPr>
+          <w:p>
+            <w:pPr>
+              <w:spacing w:after="0"/>
+            </w:pPr>
+            <w:r>
+              <w:rPr>
+                <w:b w:val="0"/>
+                <w:sz w:val="21"/>
+              </w:rPr>
+              <w:t>UX/UI дизайнер</w:t>
             </w:r>
           </w:p>
         </w:tc>
@@ -208,49 +228,76 @@
         </w:trPr>
         <w:tc>
           <w:tcPr>
-            <w:tcW w:type="dxa" w:w="5083"/>
+            <w:tcW w:type="dxa" w:w="2448"/>
             <w:vAlign w:val="center"/>
             <w:shd w:fill="FFFFFF"/>
             <w:tcMar>
-              <w:top w:w="85" w:type="dxa"/>
-              <w:left w:w="85" w:type="dxa"/>
-              <w:bottom w:w="85" w:type="dxa"/>
-              <w:right w:w="85" w:type="dxa"/>
+              <w:top w:w="70" w:type="dxa"/>
+              <w:left w:w="70" w:type="dxa"/>
+              <w:bottom w:w="70" w:type="dxa"/>
+              <w:right w:w="70" w:type="dxa"/>
             </w:tcMar>
           </w:tcPr>
           <w:p>
             <w:pPr>
-              <w:spacing w:after="0" w:line="247" w:lineRule="auto"/>
+              <w:spacing w:after="0"/>
             </w:pPr>
             <w:r>
               <w:rPr>
+                <w:b w:val="0"/>
                 <w:sz w:val="21"/>
               </w:rPr>
-              <w:t>Существующий набор статей, смены, дом, комбо, кофе и усталость.</w:t>
+              <w:t>Основная графика</w:t>
             </w:r>
           </w:p>
         </w:tc>
         <w:tc>
           <w:tcPr>
-            <w:tcW w:type="dxa" w:w="5083"/>
+            <w:tcW w:type="dxa" w:w="5688"/>
             <w:vAlign w:val="center"/>
             <w:shd w:fill="FFFFFF"/>
             <w:tcMar>
-              <w:top w:w="85" w:type="dxa"/>
-              <w:left w:w="85" w:type="dxa"/>
-              <w:bottom w:w="85" w:type="dxa"/>
-              <w:right w:w="85" w:type="dxa"/>
+              <w:top w:w="70" w:type="dxa"/>
+              <w:left w:w="70" w:type="dxa"/>
+              <w:bottom w:w="70" w:type="dxa"/>
+              <w:right w:w="70" w:type="dxa"/>
             </w:tcMar>
           </w:tcPr>
           <w:p>
             <w:pPr>
-              <w:spacing w:after="0" w:line="247" w:lineRule="auto"/>
+              <w:spacing w:after="0"/>
             </w:pPr>
             <w:r>
               <w:rPr>
+                <w:b w:val="0"/>
                 <w:sz w:val="21"/>
               </w:rPr>
-              <w:t>Большие новые пакеты статей, генерацию текста, ручной ввод заголовков и поиск фактов в интернете.</w:t>
+              <w:t>Два фона, предметы стола и комнаты, героиня и босс. Интерактивные предметы — отдельными слоями; сложные анимации пока не нужны.</w:t>
+            </w:r>
+          </w:p>
+        </w:tc>
+        <w:tc>
+          <w:tcPr>
+            <w:tcW w:type="dxa" w:w="2232"/>
+            <w:vAlign w:val="center"/>
+            <w:shd w:fill="FFFFFF"/>
+            <w:tcMar>
+              <w:top w:w="70" w:type="dxa"/>
+              <w:left w:w="70" w:type="dxa"/>
+              <w:bottom w:w="70" w:type="dxa"/>
+              <w:right w:w="70" w:type="dxa"/>
+            </w:tcMar>
+          </w:tcPr>
+          <w:p>
+            <w:pPr>
+              <w:spacing w:after="0"/>
+            </w:pPr>
+            <w:r>
+              <w:rPr>
+                <w:b w:val="0"/>
+                <w:sz w:val="21"/>
+              </w:rPr>
+              <w:t>Художник</w:t>
             </w:r>
           </w:p>
         </w:tc>
@@ -261,49 +308,156 @@
         </w:trPr>
         <w:tc>
           <w:tcPr>
-            <w:tcW w:type="dxa" w:w="5083"/>
+            <w:tcW w:type="dxa" w:w="2448"/>
             <w:vAlign w:val="center"/>
-            <w:shd w:fill="F2F5F7"/>
+            <w:shd w:fill="FFFFFF"/>
             <w:tcMar>
-              <w:top w:w="85" w:type="dxa"/>
-              <w:left w:w="85" w:type="dxa"/>
-              <w:bottom w:w="85" w:type="dxa"/>
-              <w:right w:w="85" w:type="dxa"/>
+              <w:top w:w="70" w:type="dxa"/>
+              <w:left w:w="70" w:type="dxa"/>
+              <w:bottom w:w="70" w:type="dxa"/>
+              <w:right w:w="70" w:type="dxa"/>
             </w:tcMar>
           </w:tcPr>
           <w:p>
             <w:pPr>
-              <w:spacing w:after="0" w:line="247" w:lineRule="auto"/>
+              <w:spacing w:after="0"/>
             </w:pPr>
             <w:r>
               <w:rPr>
+                <w:b w:val="0"/>
                 <w:sz w:val="21"/>
               </w:rPr>
-              <w:t>Понятный интерфейс, паузу, перезапуск и основные состояния предметов.</w:t>
+              <w:t>Статьи и баланс</w:t>
             </w:r>
           </w:p>
         </w:tc>
         <w:tc>
           <w:tcPr>
-            <w:tcW w:type="dxa" w:w="5083"/>
+            <w:tcW w:type="dxa" w:w="5688"/>
             <w:vAlign w:val="center"/>
-            <w:shd w:fill="F2F5F7"/>
+            <w:shd w:fill="FFFFFF"/>
             <w:tcMar>
-              <w:top w:w="85" w:type="dxa"/>
-              <w:left w:w="85" w:type="dxa"/>
-              <w:bottom w:w="85" w:type="dxa"/>
-              <w:right w:w="85" w:type="dxa"/>
+              <w:top w:w="70" w:type="dxa"/>
+              <w:left w:w="70" w:type="dxa"/>
+              <w:bottom w:w="70" w:type="dxa"/>
+              <w:right w:w="70" w:type="dxa"/>
             </w:tcMar>
           </w:tcPr>
           <w:p>
             <w:pPr>
-              <w:spacing w:after="0" w:line="247" w:lineRule="auto"/>
+              <w:spacing w:after="0"/>
             </w:pPr>
             <w:r>
               <w:rPr>
+                <w:b w:val="0"/>
                 <w:sz w:val="21"/>
               </w:rPr>
-              <w:t>Сохранения между запусками, магазин улучшений, декор комнаты, мультиплеер и мобильную версию.</w:t>
+              <w:t>Пройти имеющийся набор: сократить затянутые источники, объяснить штрафы, проверить комбо. Еда нужна, кофе полезен, первые ошибки не кажутся случайным наказанием.</w:t>
+            </w:r>
+          </w:p>
+        </w:tc>
+        <w:tc>
+          <w:tcPr>
+            <w:tcW w:type="dxa" w:w="2232"/>
+            <w:vAlign w:val="center"/>
+            <w:shd w:fill="FFFFFF"/>
+            <w:tcMar>
+              <w:top w:w="70" w:type="dxa"/>
+              <w:left w:w="70" w:type="dxa"/>
+              <w:bottom w:w="70" w:type="dxa"/>
+              <w:right w:w="70" w:type="dxa"/>
+            </w:tcMar>
+          </w:tcPr>
+          <w:p>
+            <w:pPr>
+              <w:spacing w:after="0"/>
+            </w:pPr>
+            <w:r>
+              <w:rPr>
+                <w:b w:val="0"/>
+                <w:sz w:val="21"/>
+              </w:rPr>
+              <w:t>Ты</w:t>
+            </w:r>
+          </w:p>
+        </w:tc>
+      </w:tr>
+      <w:tr>
+        <w:trPr>
+          <w:cantSplit/>
+        </w:trPr>
+        <w:tc>
+          <w:tcPr>
+            <w:tcW w:type="dxa" w:w="2448"/>
+            <w:vAlign w:val="center"/>
+            <w:shd w:fill="FFFFFF"/>
+            <w:tcMar>
+              <w:top w:w="70" w:type="dxa"/>
+              <w:left w:w="70" w:type="dxa"/>
+              <w:bottom w:w="70" w:type="dxa"/>
+              <w:right w:w="70" w:type="dxa"/>
+            </w:tcMar>
+          </w:tcPr>
+          <w:p>
+            <w:pPr>
+              <w:spacing w:after="0"/>
+            </w:pPr>
+            <w:r>
+              <w:rPr>
+                <w:b w:val="0"/>
+                <w:sz w:val="21"/>
+              </w:rPr>
+              <w:t>Собрать всё в игре</w:t>
+            </w:r>
+          </w:p>
+        </w:tc>
+        <w:tc>
+          <w:tcPr>
+            <w:tcW w:type="dxa" w:w="5688"/>
+            <w:vAlign w:val="center"/>
+            <w:shd w:fill="FFFFFF"/>
+            <w:tcMar>
+              <w:top w:w="70" w:type="dxa"/>
+              <w:left w:w="70" w:type="dxa"/>
+              <w:bottom w:w="70" w:type="dxa"/>
+              <w:right w:w="70" w:type="dxa"/>
+            </w:tcMar>
+          </w:tcPr>
+          <w:p>
+            <w:pPr>
+              <w:spacing w:after="0"/>
+            </w:pPr>
+            <w:r>
+              <w:rPr>
+                <w:b w:val="0"/>
+                <w:sz w:val="21"/>
+              </w:rPr>
+              <w:t>Подключить макеты и графику. Новый игрок проходит смену, покупает еду и кофе, начинает следующий день без помощи команды.</w:t>
+            </w:r>
+          </w:p>
+        </w:tc>
+        <w:tc>
+          <w:tcPr>
+            <w:tcW w:type="dxa" w:w="2232"/>
+            <w:vAlign w:val="center"/>
+            <w:shd w:fill="FFFFFF"/>
+            <w:tcMar>
+              <w:top w:w="70" w:type="dxa"/>
+              <w:left w:w="70" w:type="dxa"/>
+              <w:bottom w:w="70" w:type="dxa"/>
+              <w:right w:w="70" w:type="dxa"/>
+            </w:tcMar>
+          </w:tcPr>
+          <w:p>
+            <w:pPr>
+              <w:spacing w:after="0"/>
+            </w:pPr>
+            <w:r>
+              <w:rPr>
+                <w:b w:val="0"/>
+                <w:sz w:val="21"/>
+              </w:rPr>
+              <w:t>Ты</w:t>
             </w:r>
           </w:p>
         </w:tc>
@@ -311,128 +465,10 @@
     </w:tbl>
     <w:p>
       <w:pPr>
-        <w:spacing w:after="0"/>
-      </w:pPr>
-    </w:p>
-    <w:p>
-      <w:r>
-        <w:t>Новые идеи не становятся обязательными автоматически. Сначала оцениваем, какую пользу они дают прототипу и какую работу ради них придётся отложить.</w:t>
-      </w:r>
-    </w:p>
-    <w:p>
-      <w:r>
-        <w:br w:type="page"/>
-      </w:r>
-    </w:p>
-    <w:p>
-      <w:pPr>
         <w:pStyle w:val="Heading1"/>
       </w:pPr>
       <w:r>
-        <w:t>1 Игровой цикл</w:t>
-      </w:r>
-    </w:p>
-    <w:p>
-      <w:pPr>
-        <w:pStyle w:val="Heading2"/>
-      </w:pPr>
-      <w:r>
-        <w:t>История героини</w:t>
-      </w:r>
-    </w:p>
-    <w:p>
-      <w:r>
-        <w:t>Героиня без денег и жилья получает работу в редакции. Ей нужны заработок, еда и возможность сохранить комнату. Босс объясняет, что газете нужны охваты. Письма жителей, полицейские рапорты и другие источники заставляют выбирать между привлекательной подачей и точностью.</w:t>
-      </w:r>
-    </w:p>
-    <w:p>
-      <w:r>
-        <w:t>История раскрывается через материалы и последствия публикаций. Вступление должно быстро объяснить, почему героиня здесь и что она рискует потерять. Отдельная большая диалоговая система для прототипа не нужна.</w:t>
-      </w:r>
-    </w:p>
-    <w:p>
-      <w:pPr>
-        <w:pStyle w:val="Heading2"/>
-      </w:pPr>
-      <w:r>
-        <w:t>Один день</w:t>
-      </w:r>
-    </w:p>
-    <w:p>
-      <w:r>
-        <w:t>Прочитать источник → выбрать один из трёх заголовков → подтвердить публикацию → увидеть последствия → взять следующий материал. После смены: оплатить жильё → купить еду и при желании кофе → лечь спать → начать следующий день.</w:t>
-      </w:r>
-    </w:p>
-    <w:p>
-      <w:pPr>
-        <w:pStyle w:val="Heading2"/>
-      </w:pPr>
-      <w:r>
-        <w:t>Публикация</w:t>
-      </w:r>
-    </w:p>
-    <w:p>
-      <w:r>
-        <w:t>Источник открывается автоматически. Его можно сразу свернуть и перечитать через записку на столе. Время на чтение расходуется естественно: обязательной задержки перед выбором нет.</w:t>
-      </w:r>
-    </w:p>
-    <w:p>
-      <w:r>
-        <w:t>Три готовых заголовка перемешиваются. Игрок выбирает вариант и отдельно подтверждает печать. До подтверждения можно вернуться к вариантам. Цифры влияния и объяснение последствий показываются только после публикации.</w:t>
-      </w:r>
-    </w:p>
-    <w:p>
-      <w:r>
-        <w:t>Подтверждённая статья сразу покидает очередь. Неподтверждённая сохраняется на следующий день вместе с порядком заголовков. Отменённый выбор не приносит деньги и не меняет показатели.</w:t>
-      </w:r>
-    </w:p>
-    <w:p>
-      <w:pPr>
-        <w:pStyle w:val="Heading2"/>
-      </w:pPr>
-      <w:r>
-        <w:t>Граница выпуска</w:t>
-      </w:r>
-    </w:p>
-    <w:p>
-      <w:r>
-        <w:t>Обычная смена длится три минуты и вмещает до десяти публикаций. Таймер идёт во время чтения, выбора, подтверждения и просмотра последствий. Пауза останавливает время и расход сил, закрывая рабочий стол. Выпуск можно сдать досрочно.</w:t>
-      </w:r>
-    </w:p>
-    <w:p>
-      <w:r>
-        <w:t>После десятой публикации игрок видит её результат и сообщение: «В текущем выпуске газеты недостаточно места для новых публикаций». Кнопка «Сдать выпуск и пойти домой» завершает смену. Истечение таймера тоже переводит домой. Аренда списывается один раз.</w:t>
-      </w:r>
-    </w:p>
-    <w:p>
-      <w:pPr>
-        <w:pStyle w:val="Heading2"/>
-      </w:pPr>
-      <w:r>
-        <w:t>Комбо</w:t>
-      </w:r>
-    </w:p>
-    <w:p>
-      <w:r>
-        <w:t>У заголовка есть редакционный тип: факты, сенсация или поддержка власти. Последовательные публикации одного типа дают ×1 → ×1,25 → ×1,5 → ×1,75 → ×2. Новый тип начинает серию заново; новая смена сбрасывает комбо.</w:t>
-      </w:r>
-    </w:p>
-    <w:p>
-      <w:r>
-        <w:t>Множитель усиливает деньги, репутацию и лояльность, включая штрафы. Выносливость, покупки и аренда не умножаются. Тип описывает подачу, а не гарантирует истинность. Слева показаны текущая серия и множитель следующей публикации такого же типа.</w:t>
-      </w:r>
-    </w:p>
-    <w:p>
-      <w:r>
-        <w:br w:type="page"/>
-      </w:r>
-    </w:p>
-    <w:p>
-      <w:pPr>
-        <w:pStyle w:val="Heading1"/>
-      </w:pPr>
-      <w:r>
-        <w:t>2 Ресурсы и стартовый баланс</w:t>
+        <w:t>Следом — полезно добавить если основной цикл готов</w:t>
       </w:r>
     </w:p>
     <w:tbl>
@@ -451,8 +487,9 @@
         </w:tblBorders>
       </w:tblPr>
       <w:tblGrid>
-        <w:gridCol w:w="2923"/>
-        <w:gridCol w:w="7243"/>
+        <w:gridCol w:w="2448"/>
+        <w:gridCol w:w="5688"/>
+        <w:gridCol w:w="2232"/>
       </w:tblGrid>
       <w:tr>
         <w:trPr>
@@ -461,53 +498,76 @@
         </w:trPr>
         <w:tc>
           <w:tcPr>
-            <w:tcW w:type="dxa" w:w="2923"/>
+            <w:tcW w:type="dxa" w:w="2448"/>
             <w:vAlign w:val="center"/>
-            <w:shd w:fill="243B48"/>
+            <w:shd w:fill="DDE7ED"/>
             <w:tcMar>
-              <w:top w:w="85" w:type="dxa"/>
-              <w:left w:w="85" w:type="dxa"/>
-              <w:bottom w:w="85" w:type="dxa"/>
-              <w:right w:w="85" w:type="dxa"/>
+              <w:top w:w="70" w:type="dxa"/>
+              <w:left w:w="70" w:type="dxa"/>
+              <w:bottom w:w="70" w:type="dxa"/>
+              <w:right w:w="70" w:type="dxa"/>
             </w:tcMar>
           </w:tcPr>
           <w:p>
             <w:pPr>
-              <w:spacing w:after="0" w:line="247" w:lineRule="auto"/>
+              <w:spacing w:after="0"/>
             </w:pPr>
             <w:r>
               <w:rPr>
                 <w:b/>
-                <w:color w:val="FFFFFF"/>
                 <w:sz w:val="21"/>
               </w:rPr>
-              <w:t>Параметр</w:t>
+              <w:t>Добавление</w:t>
             </w:r>
           </w:p>
         </w:tc>
         <w:tc>
           <w:tcPr>
-            <w:tcW w:type="dxa" w:w="7243"/>
+            <w:tcW w:type="dxa" w:w="5688"/>
             <w:vAlign w:val="center"/>
-            <w:shd w:fill="243B48"/>
+            <w:shd w:fill="DDE7ED"/>
             <w:tcMar>
-              <w:top w:w="85" w:type="dxa"/>
-              <w:left w:w="85" w:type="dxa"/>
-              <w:bottom w:w="85" w:type="dxa"/>
-              <w:right w:w="85" w:type="dxa"/>
+              <w:top w:w="70" w:type="dxa"/>
+              <w:left w:w="70" w:type="dxa"/>
+              <w:bottom w:w="70" w:type="dxa"/>
+              <w:right w:w="70" w:type="dxa"/>
             </w:tcMar>
           </w:tcPr>
           <w:p>
             <w:pPr>
-              <w:spacing w:after="0" w:line="247" w:lineRule="auto"/>
+              <w:spacing w:after="0"/>
             </w:pPr>
             <w:r>
               <w:rPr>
                 <w:b/>
-                <w:color w:val="FFFFFF"/>
                 <w:sz w:val="21"/>
               </w:rPr>
-              <w:t>Стартовая настройка для игры</w:t>
+              <w:t>Зачем</w:t>
+            </w:r>
+          </w:p>
+        </w:tc>
+        <w:tc>
+          <w:tcPr>
+            <w:tcW w:type="dxa" w:w="2232"/>
+            <w:vAlign w:val="center"/>
+            <w:shd w:fill="DDE7ED"/>
+            <w:tcMar>
+              <w:top w:w="70" w:type="dxa"/>
+              <w:left w:w="70" w:type="dxa"/>
+              <w:bottom w:w="70" w:type="dxa"/>
+              <w:right w:w="70" w:type="dxa"/>
+            </w:tcMar>
+          </w:tcPr>
+          <w:p>
+            <w:pPr>
+              <w:spacing w:after="0"/>
+            </w:pPr>
+            <w:r>
+              <w:rPr>
+                <w:b/>
+                <w:sz w:val="21"/>
+              </w:rPr>
+              <w:t>Кто ведёт</w:t>
             </w:r>
           </w:p>
         </w:tc>
@@ -518,49 +578,76 @@
         </w:trPr>
         <w:tc>
           <w:tcPr>
-            <w:tcW w:type="dxa" w:w="2923"/>
+            <w:tcW w:type="dxa" w:w="2448"/>
             <w:vAlign w:val="center"/>
-            <w:shd w:fill="F2F5F7"/>
+            <w:shd w:fill="FFFFFF"/>
             <w:tcMar>
-              <w:top w:w="85" w:type="dxa"/>
-              <w:left w:w="85" w:type="dxa"/>
-              <w:bottom w:w="85" w:type="dxa"/>
-              <w:right w:w="85" w:type="dxa"/>
+              <w:top w:w="70" w:type="dxa"/>
+              <w:left w:w="70" w:type="dxa"/>
+              <w:bottom w:w="70" w:type="dxa"/>
+              <w:right w:w="70" w:type="dxa"/>
             </w:tcMar>
           </w:tcPr>
           <w:p>
             <w:pPr>
-              <w:spacing w:after="0" w:line="247" w:lineRule="auto"/>
+              <w:spacing w:after="0"/>
             </w:pPr>
             <w:r>
               <w:rPr>
+                <w:b w:val="0"/>
                 <w:sz w:val="21"/>
               </w:rPr>
-              <w:t>Основные шкалы</w:t>
+              <w:t>Отклик на действие</w:t>
             </w:r>
           </w:p>
         </w:tc>
         <w:tc>
           <w:tcPr>
-            <w:tcW w:type="dxa" w:w="7243"/>
+            <w:tcW w:type="dxa" w:w="5688"/>
             <w:vAlign w:val="center"/>
-            <w:shd w:fill="F2F5F7"/>
+            <w:shd w:fill="FFFFFF"/>
             <w:tcMar>
-              <w:top w:w="85" w:type="dxa"/>
-              <w:left w:w="85" w:type="dxa"/>
-              <w:bottom w:w="85" w:type="dxa"/>
-              <w:right w:w="85" w:type="dxa"/>
+              <w:top w:w="70" w:type="dxa"/>
+              <w:left w:w="70" w:type="dxa"/>
+              <w:bottom w:w="70" w:type="dxa"/>
+              <w:right w:w="70" w:type="dxa"/>
             </w:tcMar>
           </w:tcPr>
           <w:p>
             <w:pPr>
-              <w:spacing w:after="0" w:line="247" w:lineRule="auto"/>
+              <w:spacing w:after="0"/>
             </w:pPr>
             <w:r>
               <w:rPr>
+                <w:b w:val="0"/>
                 <w:sz w:val="21"/>
               </w:rPr>
-              <w:t>Выносливость, репутация компании и лояльность государству; максимум каждой — 100.</w:t>
+              <w:t>Коротко подсветить изменившуюся шкалу; добавить звуки печати, покупки и конца смены. Выбор ощущается действием.</w:t>
+            </w:r>
+          </w:p>
+        </w:tc>
+        <w:tc>
+          <w:tcPr>
+            <w:tcW w:type="dxa" w:w="2232"/>
+            <w:vAlign w:val="center"/>
+            <w:shd w:fill="FFFFFF"/>
+            <w:tcMar>
+              <w:top w:w="70" w:type="dxa"/>
+              <w:left w:w="70" w:type="dxa"/>
+              <w:bottom w:w="70" w:type="dxa"/>
+              <w:right w:w="70" w:type="dxa"/>
+            </w:tcMar>
+          </w:tcPr>
+          <w:p>
+            <w:pPr>
+              <w:spacing w:after="0"/>
+            </w:pPr>
+            <w:r>
+              <w:rPr>
+                <w:b w:val="0"/>
+                <w:sz w:val="21"/>
+              </w:rPr>
+              <w:t>Ты + UX/UI</w:t>
             </w:r>
           </w:p>
         </w:tc>
@@ -571,49 +658,76 @@
         </w:trPr>
         <w:tc>
           <w:tcPr>
-            <w:tcW w:type="dxa" w:w="2923"/>
+            <w:tcW w:type="dxa" w:w="2448"/>
             <w:vAlign w:val="center"/>
             <w:shd w:fill="FFFFFF"/>
             <w:tcMar>
-              <w:top w:w="85" w:type="dxa"/>
-              <w:left w:w="85" w:type="dxa"/>
-              <w:bottom w:w="85" w:type="dxa"/>
-              <w:right w:w="85" w:type="dxa"/>
+              <w:top w:w="70" w:type="dxa"/>
+              <w:left w:w="70" w:type="dxa"/>
+              <w:bottom w:w="70" w:type="dxa"/>
+              <w:right w:w="70" w:type="dxa"/>
             </w:tcMar>
           </w:tcPr>
           <w:p>
             <w:pPr>
-              <w:spacing w:after="0" w:line="247" w:lineRule="auto"/>
+              <w:spacing w:after="0"/>
             </w:pPr>
             <w:r>
               <w:rPr>
+                <w:b w:val="0"/>
                 <w:sz w:val="21"/>
               </w:rPr>
-              <w:t>Начало попытки</w:t>
+              <w:t>Завершение демо</w:t>
             </w:r>
           </w:p>
         </w:tc>
         <w:tc>
           <w:tcPr>
-            <w:tcW w:type="dxa" w:w="7243"/>
+            <w:tcW w:type="dxa" w:w="5688"/>
             <w:vAlign w:val="center"/>
             <w:shd w:fill="FFFFFF"/>
             <w:tcMar>
-              <w:top w:w="85" w:type="dxa"/>
-              <w:left w:w="85" w:type="dxa"/>
-              <w:bottom w:w="85" w:type="dxa"/>
-              <w:right w:w="85" w:type="dxa"/>
+              <w:top w:w="70" w:type="dxa"/>
+              <w:left w:w="70" w:type="dxa"/>
+              <w:bottom w:w="70" w:type="dxa"/>
+              <w:right w:w="70" w:type="dxa"/>
             </w:tcMar>
           </w:tcPr>
           <w:p>
             <w:pPr>
-              <w:spacing w:after="0" w:line="247" w:lineRule="auto"/>
+              <w:spacing w:after="0"/>
             </w:pPr>
             <w:r>
               <w:rPr>
+                <w:b w:val="0"/>
                 <w:sz w:val="21"/>
               </w:rPr>
-              <w:t>Выносливость 80; репутация 65; лояльность 65; деньги 35 $.</w:t>
+              <w:t>Обсудить итог после трёх смен: получится законченный показ без повторов статей. Пока это предложение, не обязательная новая концовка.</w:t>
+            </w:r>
+          </w:p>
+        </w:tc>
+        <w:tc>
+          <w:tcPr>
+            <w:tcW w:type="dxa" w:w="2232"/>
+            <w:vAlign w:val="center"/>
+            <w:shd w:fill="FFFFFF"/>
+            <w:tcMar>
+              <w:top w:w="70" w:type="dxa"/>
+              <w:left w:w="70" w:type="dxa"/>
+              <w:bottom w:w="70" w:type="dxa"/>
+              <w:right w:w="70" w:type="dxa"/>
+            </w:tcMar>
+          </w:tcPr>
+          <w:p>
+            <w:pPr>
+              <w:spacing w:after="0"/>
+            </w:pPr>
+            <w:r>
+              <w:rPr>
+                <w:b w:val="0"/>
+                <w:sz w:val="21"/>
+              </w:rPr>
+              <w:t>Ты</w:t>
             </w:r>
           </w:p>
         </w:tc>
@@ -624,473 +738,76 @@
         </w:trPr>
         <w:tc>
           <w:tcPr>
-            <w:tcW w:type="dxa" w:w="2923"/>
+            <w:tcW w:type="dxa" w:w="2448"/>
             <w:vAlign w:val="center"/>
-            <w:shd w:fill="F2F5F7"/>
+            <w:shd w:fill="FFFFFF"/>
             <w:tcMar>
-              <w:top w:w="85" w:type="dxa"/>
-              <w:left w:w="85" w:type="dxa"/>
-              <w:bottom w:w="85" w:type="dxa"/>
-              <w:right w:w="85" w:type="dxa"/>
+              <w:top w:w="70" w:type="dxa"/>
+              <w:left w:w="70" w:type="dxa"/>
+              <w:bottom w:w="70" w:type="dxa"/>
+              <w:right w:w="70" w:type="dxa"/>
             </w:tcMar>
           </w:tcPr>
           <w:p>
             <w:pPr>
-              <w:spacing w:after="0" w:line="247" w:lineRule="auto"/>
+              <w:spacing w:after="0"/>
             </w:pPr>
             <w:r>
               <w:rPr>
+                <w:b w:val="0"/>
                 <w:sz w:val="21"/>
               </w:rPr>
-              <w:t>Смена и выпуск</w:t>
+              <w:t>Выключение помех</w:t>
             </w:r>
           </w:p>
         </w:tc>
         <w:tc>
           <w:tcPr>
-            <w:tcW w:type="dxa" w:w="7243"/>
+            <w:tcW w:type="dxa" w:w="5688"/>
             <w:vAlign w:val="center"/>
-            <w:shd w:fill="F2F5F7"/>
+            <w:shd w:fill="FFFFFF"/>
             <w:tcMar>
-              <w:top w:w="85" w:type="dxa"/>
-              <w:left w:w="85" w:type="dxa"/>
-              <w:bottom w:w="85" w:type="dxa"/>
-              <w:right w:w="85" w:type="dxa"/>
+              <w:top w:w="70" w:type="dxa"/>
+              <w:left w:w="70" w:type="dxa"/>
+              <w:bottom w:w="70" w:type="dxa"/>
+              <w:right w:w="70" w:type="dxa"/>
             </w:tcMar>
           </w:tcPr>
           <w:p>
             <w:pPr>
-              <w:spacing w:after="0" w:line="247" w:lineRule="auto"/>
+              <w:spacing w:after="0"/>
             </w:pPr>
             <w:r>
               <w:rPr>
+                <w:b w:val="0"/>
                 <w:sz w:val="21"/>
               </w:rPr>
-              <w:t>180 секунд; не более 10 публикаций за день.</w:t>
-            </w:r>
-          </w:p>
-        </w:tc>
-      </w:tr>
-      <w:tr>
-        <w:trPr>
-          <w:cantSplit/>
-        </w:trPr>
-        <w:tc>
-          <w:tcPr>
-            <w:tcW w:type="dxa" w:w="2923"/>
-            <w:vAlign w:val="center"/>
-            <w:shd w:fill="FFFFFF"/>
-            <w:tcMar>
-              <w:top w:w="85" w:type="dxa"/>
-              <w:left w:w="85" w:type="dxa"/>
-              <w:bottom w:w="85" w:type="dxa"/>
-              <w:right w:w="85" w:type="dxa"/>
-            </w:tcMar>
-          </w:tcPr>
-          <w:p>
-            <w:pPr>
-              <w:spacing w:after="0" w:line="247" w:lineRule="auto"/>
-            </w:pPr>
-            <w:r>
-              <w:rPr>
-                <w:sz w:val="21"/>
-              </w:rPr>
-              <w:t>Расход сил</w:t>
+              <w:t>Дать игроку отключать глитчи из меню, если они мешают читать.</w:t>
             </w:r>
           </w:p>
         </w:tc>
         <w:tc>
           <w:tcPr>
-            <w:tcW w:type="dxa" w:w="7243"/>
+            <w:tcW w:type="dxa" w:w="2232"/>
             <w:vAlign w:val="center"/>
             <w:shd w:fill="FFFFFF"/>
             <w:tcMar>
-              <w:top w:w="85" w:type="dxa"/>
-              <w:left w:w="85" w:type="dxa"/>
-              <w:bottom w:w="85" w:type="dxa"/>
-              <w:right w:w="85" w:type="dxa"/>
+              <w:top w:w="70" w:type="dxa"/>
+              <w:left w:w="70" w:type="dxa"/>
+              <w:bottom w:w="70" w:type="dxa"/>
+              <w:right w:w="70" w:type="dxa"/>
             </w:tcMar>
           </w:tcPr>
           <w:p>
             <w:pPr>
-              <w:spacing w:after="0" w:line="247" w:lineRule="auto"/>
+              <w:spacing w:after="0"/>
             </w:pPr>
             <w:r>
               <w:rPr>
+                <w:b w:val="0"/>
                 <w:sz w:val="21"/>
               </w:rPr>
-              <w:t>0,1 в секунду работы и 1,5 за публикацию.</w:t>
-            </w:r>
-          </w:p>
-        </w:tc>
-      </w:tr>
-      <w:tr>
-        <w:trPr>
-          <w:cantSplit/>
-        </w:trPr>
-        <w:tc>
-          <w:tcPr>
-            <w:tcW w:type="dxa" w:w="2923"/>
-            <w:vAlign w:val="center"/>
-            <w:shd w:fill="F2F5F7"/>
-            <w:tcMar>
-              <w:top w:w="85" w:type="dxa"/>
-              <w:left w:w="85" w:type="dxa"/>
-              <w:bottom w:w="85" w:type="dxa"/>
-              <w:right w:w="85" w:type="dxa"/>
-            </w:tcMar>
-          </w:tcPr>
-          <w:p>
-            <w:pPr>
-              <w:spacing w:after="0" w:line="247" w:lineRule="auto"/>
-            </w:pPr>
-            <w:r>
-              <w:rPr>
-                <w:sz w:val="21"/>
-              </w:rPr>
-              <w:t>Аренда</w:t>
-            </w:r>
-          </w:p>
-        </w:tc>
-        <w:tc>
-          <w:tcPr>
-            <w:tcW w:type="dxa" w:w="7243"/>
-            <w:vAlign w:val="center"/>
-            <w:shd w:fill="F2F5F7"/>
-            <w:tcMar>
-              <w:top w:w="85" w:type="dxa"/>
-              <w:left w:w="85" w:type="dxa"/>
-              <w:bottom w:w="85" w:type="dxa"/>
-              <w:right w:w="85" w:type="dxa"/>
-            </w:tcMar>
-          </w:tcPr>
-          <w:p>
-            <w:pPr>
-              <w:spacing w:after="0" w:line="247" w:lineRule="auto"/>
-            </w:pPr>
-            <w:r>
-              <w:rPr>
-                <w:sz w:val="21"/>
-              </w:rPr>
-              <w:t>45 $ после каждой завершённой смены.</w:t>
-            </w:r>
-          </w:p>
-        </w:tc>
-      </w:tr>
-      <w:tr>
-        <w:trPr>
-          <w:cantSplit/>
-        </w:trPr>
-        <w:tc>
-          <w:tcPr>
-            <w:tcW w:type="dxa" w:w="2923"/>
-            <w:vAlign w:val="center"/>
-            <w:shd w:fill="FFFFFF"/>
-            <w:tcMar>
-              <w:top w:w="85" w:type="dxa"/>
-              <w:left w:w="85" w:type="dxa"/>
-              <w:bottom w:w="85" w:type="dxa"/>
-              <w:right w:w="85" w:type="dxa"/>
-            </w:tcMar>
-          </w:tcPr>
-          <w:p>
-            <w:pPr>
-              <w:spacing w:after="0" w:line="247" w:lineRule="auto"/>
-            </w:pPr>
-            <w:r>
-              <w:rPr>
-                <w:sz w:val="21"/>
-              </w:rPr>
-              <w:t>Ужин</w:t>
-            </w:r>
-          </w:p>
-        </w:tc>
-        <w:tc>
-          <w:tcPr>
-            <w:tcW w:type="dxa" w:w="7243"/>
-            <w:vAlign w:val="center"/>
-            <w:shd w:fill="FFFFFF"/>
-            <w:tcMar>
-              <w:top w:w="85" w:type="dxa"/>
-              <w:left w:w="85" w:type="dxa"/>
-              <w:bottom w:w="85" w:type="dxa"/>
-              <w:right w:w="85" w:type="dxa"/>
-            </w:tcMar>
-          </w:tcPr>
-          <w:p>
-            <w:pPr>
-              <w:spacing w:after="0" w:line="247" w:lineRule="auto"/>
-            </w:pPr>
-            <w:r>
-              <w:rPr>
-                <w:sz w:val="21"/>
-              </w:rPr>
-              <w:t>25 $; восстанавливает 35 сил.</w:t>
-            </w:r>
-          </w:p>
-        </w:tc>
-      </w:tr>
-      <w:tr>
-        <w:trPr>
-          <w:cantSplit/>
-        </w:trPr>
-        <w:tc>
-          <w:tcPr>
-            <w:tcW w:type="dxa" w:w="2923"/>
-            <w:vAlign w:val="center"/>
-            <w:shd w:fill="F2F5F7"/>
-            <w:tcMar>
-              <w:top w:w="85" w:type="dxa"/>
-              <w:left w:w="85" w:type="dxa"/>
-              <w:bottom w:w="85" w:type="dxa"/>
-              <w:right w:w="85" w:type="dxa"/>
-            </w:tcMar>
-          </w:tcPr>
-          <w:p>
-            <w:pPr>
-              <w:spacing w:after="0" w:line="247" w:lineRule="auto"/>
-            </w:pPr>
-            <w:r>
-              <w:rPr>
-                <w:sz w:val="21"/>
-              </w:rPr>
-              <w:t>Перекус</w:t>
-            </w:r>
-          </w:p>
-        </w:tc>
-        <w:tc>
-          <w:tcPr>
-            <w:tcW w:type="dxa" w:w="7243"/>
-            <w:vAlign w:val="center"/>
-            <w:shd w:fill="F2F5F7"/>
-            <w:tcMar>
-              <w:top w:w="85" w:type="dxa"/>
-              <w:left w:w="85" w:type="dxa"/>
-              <w:bottom w:w="85" w:type="dxa"/>
-              <w:right w:w="85" w:type="dxa"/>
-            </w:tcMar>
-          </w:tcPr>
-          <w:p>
-            <w:pPr>
-              <w:spacing w:after="0" w:line="247" w:lineRule="auto"/>
-            </w:pPr>
-            <w:r>
-              <w:rPr>
-                <w:sz w:val="21"/>
-              </w:rPr>
-              <w:t>12 $; восстанавливает 15 сил.</w:t>
-            </w:r>
-          </w:p>
-        </w:tc>
-      </w:tr>
-      <w:tr>
-        <w:trPr>
-          <w:cantSplit/>
-        </w:trPr>
-        <w:tc>
-          <w:tcPr>
-            <w:tcW w:type="dxa" w:w="2923"/>
-            <w:vAlign w:val="center"/>
-            <w:shd w:fill="FFFFFF"/>
-            <w:tcMar>
-              <w:top w:w="85" w:type="dxa"/>
-              <w:left w:w="85" w:type="dxa"/>
-              <w:bottom w:w="85" w:type="dxa"/>
-              <w:right w:w="85" w:type="dxa"/>
-            </w:tcMar>
-          </w:tcPr>
-          <w:p>
-            <w:pPr>
-              <w:spacing w:after="0" w:line="247" w:lineRule="auto"/>
-            </w:pPr>
-            <w:r>
-              <w:rPr>
-                <w:sz w:val="21"/>
-              </w:rPr>
-              <w:t>Кофе</w:t>
-            </w:r>
-          </w:p>
-        </w:tc>
-        <w:tc>
-          <w:tcPr>
-            <w:tcW w:type="dxa" w:w="7243"/>
-            <w:vAlign w:val="center"/>
-            <w:shd w:fill="FFFFFF"/>
-            <w:tcMar>
-              <w:top w:w="85" w:type="dxa"/>
-              <w:left w:w="85" w:type="dxa"/>
-              <w:bottom w:w="85" w:type="dxa"/>
-              <w:right w:w="85" w:type="dxa"/>
-            </w:tcMar>
-          </w:tcPr>
-          <w:p>
-            <w:pPr>
-              <w:spacing w:after="0" w:line="247" w:lineRule="auto"/>
-            </w:pPr>
-            <w:r>
-              <w:rPr>
-                <w:sz w:val="21"/>
-              </w:rPr>
-              <w:t>15 $ дома; на смене +60 секунд и −8 сил.</w:t>
-            </w:r>
-          </w:p>
-        </w:tc>
-      </w:tr>
-      <w:tr>
-        <w:trPr>
-          <w:cantSplit/>
-        </w:trPr>
-        <w:tc>
-          <w:tcPr>
-            <w:tcW w:type="dxa" w:w="2923"/>
-            <w:vAlign w:val="center"/>
-            <w:shd w:fill="F2F5F7"/>
-            <w:tcMar>
-              <w:top w:w="85" w:type="dxa"/>
-              <w:left w:w="85" w:type="dxa"/>
-              <w:bottom w:w="85" w:type="dxa"/>
-              <w:right w:w="85" w:type="dxa"/>
-            </w:tcMar>
-          </w:tcPr>
-          <w:p>
-            <w:pPr>
-              <w:spacing w:after="0" w:line="247" w:lineRule="auto"/>
-            </w:pPr>
-            <w:r>
-              <w:rPr>
-                <w:sz w:val="21"/>
-              </w:rPr>
-              <w:t>Комбо</w:t>
-            </w:r>
-          </w:p>
-        </w:tc>
-        <w:tc>
-          <w:tcPr>
-            <w:tcW w:type="dxa" w:w="7243"/>
-            <w:vAlign w:val="center"/>
-            <w:shd w:fill="F2F5F7"/>
-            <w:tcMar>
-              <w:top w:w="85" w:type="dxa"/>
-              <w:left w:w="85" w:type="dxa"/>
-              <w:bottom w:w="85" w:type="dxa"/>
-              <w:right w:w="85" w:type="dxa"/>
-            </w:tcMar>
-          </w:tcPr>
-          <w:p>
-            <w:pPr>
-              <w:spacing w:after="0" w:line="247" w:lineRule="auto"/>
-            </w:pPr>
-            <w:r>
-              <w:rPr>
-                <w:sz w:val="21"/>
-              </w:rPr>
-              <w:t>Шаг +0,25; максимум ×2. Для баланса предел можно поднять до ×3.</w:t>
-            </w:r>
-          </w:p>
-        </w:tc>
-      </w:tr>
-      <w:tr>
-        <w:trPr>
-          <w:cantSplit/>
-        </w:trPr>
-        <w:tc>
-          <w:tcPr>
-            <w:tcW w:type="dxa" w:w="2923"/>
-            <w:vAlign w:val="center"/>
-            <w:shd w:fill="FFFFFF"/>
-            <w:tcMar>
-              <w:top w:w="85" w:type="dxa"/>
-              <w:left w:w="85" w:type="dxa"/>
-              <w:bottom w:w="85" w:type="dxa"/>
-              <w:right w:w="85" w:type="dxa"/>
-            </w:tcMar>
-          </w:tcPr>
-          <w:p>
-            <w:pPr>
-              <w:spacing w:after="0" w:line="247" w:lineRule="auto"/>
-            </w:pPr>
-            <w:r>
-              <w:rPr>
-                <w:sz w:val="21"/>
-              </w:rPr>
-              <w:t>Усталость</w:t>
-            </w:r>
-          </w:p>
-        </w:tc>
-        <w:tc>
-          <w:tcPr>
-            <w:tcW w:type="dxa" w:w="7243"/>
-            <w:vAlign w:val="center"/>
-            <w:shd w:fill="FFFFFF"/>
-            <w:tcMar>
-              <w:top w:w="85" w:type="dxa"/>
-              <w:left w:w="85" w:type="dxa"/>
-              <w:bottom w:w="85" w:type="dxa"/>
-              <w:right w:w="85" w:type="dxa"/>
-            </w:tcMar>
-          </w:tcPr>
-          <w:p>
-            <w:pPr>
-              <w:spacing w:after="0" w:line="247" w:lineRule="auto"/>
-            </w:pPr>
-            <w:r>
-              <w:rPr>
-                <w:sz w:val="21"/>
-              </w:rPr>
-              <w:t>Визуальный эффект появляется ниже 30% выносливости и усиливается по мере истощения.</w:t>
-            </w:r>
-          </w:p>
-        </w:tc>
-      </w:tr>
-      <w:tr>
-        <w:trPr>
-          <w:cantSplit/>
-        </w:trPr>
-        <w:tc>
-          <w:tcPr>
-            <w:tcW w:type="dxa" w:w="2923"/>
-            <w:vAlign w:val="center"/>
-            <w:shd w:fill="F2F5F7"/>
-            <w:tcMar>
-              <w:top w:w="85" w:type="dxa"/>
-              <w:left w:w="85" w:type="dxa"/>
-              <w:bottom w:w="85" w:type="dxa"/>
-              <w:right w:w="85" w:type="dxa"/>
-            </w:tcMar>
-          </w:tcPr>
-          <w:p>
-            <w:pPr>
-              <w:spacing w:after="0" w:line="247" w:lineRule="auto"/>
-            </w:pPr>
-            <w:r>
-              <w:rPr>
-                <w:sz w:val="21"/>
-              </w:rPr>
-              <w:t>Предел долга</w:t>
-            </w:r>
-          </w:p>
-        </w:tc>
-        <w:tc>
-          <w:tcPr>
-            <w:tcW w:type="dxa" w:w="7243"/>
-            <w:vAlign w:val="center"/>
-            <w:shd w:fill="F2F5F7"/>
-            <w:tcMar>
-              <w:top w:w="85" w:type="dxa"/>
-              <w:left w:w="85" w:type="dxa"/>
-              <w:bottom w:w="85" w:type="dxa"/>
-              <w:right w:w="85" w:type="dxa"/>
-            </w:tcMar>
-          </w:tcPr>
-          <w:p>
-            <w:pPr>
-              <w:spacing w:after="0" w:line="247" w:lineRule="auto"/>
-            </w:pPr>
-            <w:r>
-              <w:rPr>
-                <w:sz w:val="21"/>
-              </w:rPr>
-              <w:t>Проигрыш при балансе −100 $ или ниже.</w:t>
+              <w:t>UX/UI + ты</w:t>
             </w:r>
           </w:p>
         </w:tc>
@@ -1098,53 +815,15 @@
     </w:tbl>
     <w:p>
       <w:pPr>
-        <w:spacing w:after="0"/>
-      </w:pPr>
-    </w:p>
-    <w:p>
-      <w:r>
-        <w:t>Это отправная точка баланса. Окончательные цены и штрафы определяем по тому, как игроки читают материалы, используют кофе и переживают несколько смен.</w:t>
-      </w:r>
-    </w:p>
-    <w:p>
-      <w:pPr>
-        <w:pStyle w:val="Heading2"/>
+        <w:pStyle w:val="Heading1"/>
       </w:pPr>
       <w:r>
-        <w:t>Проигрыш</w:t>
+        <w:t>Потом — не задерживаем ради этого прототип</w:t>
       </w:r>
     </w:p>
     <w:p>
       <w:r>
-        <w:t>Ноль выносливости — истощение. Ноль репутации — пожар в офисе из-за недовольных читателей. Ноль лояльности — арест. Долг от 100 $ — ночлег на картонке. Концовка показывает причину и итоги попытки, затем предлагает начать заново.</w:t>
-      </w:r>
-    </w:p>
-    <w:p>
-      <w:r>
-        <w:t>Небольшой отрицательный баланс допустим. Покупка еды или кофе может довести долг до предела. Употребление кофе может обнулить силы. При одновременном проигрыше приоритет: истощение, пожар, арест, долги.</w:t>
-      </w:r>
-    </w:p>
-    <w:p>
-      <w:pPr>
-        <w:pStyle w:val="Heading2"/>
-      </w:pPr>
-      <w:r>
-        <w:t>Что важно сохранить при балансировке</w:t>
-      </w:r>
-    </w:p>
-    <w:p>
-      <w:r>
-        <w:t>У точных публикаций должна быть практическая ценность. Высокий доход сенсаций сопровождается понятным риском. Комбо не должно превращать случайный выбор в необъяснимую смерть. У игрока должна оставаться причина читать источник, а не запоминать положение выгодной карточки.</w:t>
-      </w:r>
-    </w:p>
-    <w:p>
-      <w:r>
-        <w:t>Если большинство игроков быстро упирается в десять публикаций, дополнительная минута кофе теряет ценность. Тогда сначала проверяем длину источников, темп чтения и цены, а не добавляем новую механику.</w:t>
-      </w:r>
-    </w:p>
-    <w:p>
-      <w:r>
-        <w:br w:type="page"/>
+        <w:t>Декоративные анимации, дополнительные статьи, сохранения, украшение комнаты. Сначала убедиться, что существующих решений достаточно для интересной игры.</w:t>
       </w:r>
     </w:p>
     <w:p>
@@ -1152,100 +831,12 @@
         <w:pStyle w:val="Heading1"/>
       </w:pPr>
       <w:r>
-        <w:t>3 Дом и усталость</w:t>
-      </w:r>
-    </w:p>
-    <w:p>
-      <w:pPr>
-        <w:pStyle w:val="Heading2"/>
-      </w:pPr>
-      <w:r>
-        <w:t>Дом как короткая передышка</w:t>
+        <w:t>Не берём в эту версию</w:t>
       </w:r>
     </w:p>
     <w:p>
       <w:r>
-        <w:t>Пиксельная комната показывает бытовую сторону работы. Слева находится кровать, рядом кухонный стол с кофе, справа холодильник. Игрок видит деньги, выносливость и итоги смены. Дома нет таймера и пассивного истощения.</w:t>
-      </w:r>
-    </w:p>
-    <w:p>
-      <w:pPr>
-        <w:pStyle w:val="Heading2"/>
-      </w:pPr>
-      <w:r>
-        <w:t>Еда</w:t>
-      </w:r>
-    </w:p>
-    <w:p>
-      <w:r>
-        <w:t>Наведение открывает холодильник без оплаты. Нажатие покупает еду: внутри появляются продукты и сразу восстанавливаются силы. Еду можно покупать повторно до максимума здоровья, с риском уйти в долг. Перекус доступен отдельным действием. Отдельный инвентарь продуктов не нужен.</w:t>
-      </w:r>
-    </w:p>
-    <w:p>
-      <w:pPr>
-        <w:pStyle w:val="Heading2"/>
-      </w:pPr>
-      <w:r>
-        <w:t>Кофе</w:t>
-      </w:r>
-    </w:p>
-    <w:p>
-      <w:r>
-        <w:t>Кофе покупается дома, одновременно можно носить одну чашку. На следующей смене она появляется на рабочем столе. Игрок сам выбирает момент употребления: получает дополнительную минуту и теряет немного выносливости. Невыпитая чашка переносится на следующие дни и блокирует повторную покупку.</w:t>
-      </w:r>
-    </w:p>
-    <w:p>
-      <w:r>
-        <w:t>После употребления чашка исчезает. Бумага с кофейным следом остаётся постоянной частью стола и видна даже без покупки кофе. Не нужна буквальная подпись о том, что остался след. Когда выпуск заполнен, кофе не используется и не расширяет лимит публикаций.</w:t>
-      </w:r>
-    </w:p>
-    <w:p>
-      <w:pPr>
-        <w:pStyle w:val="Heading2"/>
-      </w:pPr>
-      <w:r>
-        <w:t>Сон</w:t>
-      </w:r>
-    </w:p>
-    <w:p>
-      <w:r>
-        <w:t>Кровать запускает короткое состояние сна и переводит к следующему дню. Сон обязателен для перехода, но не восстанавливает выносливость: для этого нужна еда. Пока героиня спит, покупки недоступны.</w:t>
-      </w:r>
-    </w:p>
-    <w:p>
-      <w:pPr>
-        <w:pStyle w:val="Heading2"/>
-      </w:pPr>
-      <w:r>
-        <w:t>Визуальная усталость</w:t>
-      </w:r>
-    </w:p>
-    <w:p>
-      <w:r>
-        <w:t>Ниже порога выносливости в редакции плавно появляется виньетка, затемнение усиливается по краям. Горизонтальные глитчи сопровождаются хроматической аберрацией — расхождением цветовых каналов. Чем меньше сил, тем заметнее эффект.</w:t>
-      </w:r>
-    </w:p>
-    <w:p>
-      <w:r>
-        <w:t>Центр экрана и текст должны оставаться читаемыми. Эффект не меняет скорость курсора и таймера. В доме, паузе и концовках он отключён. Доступность настройки силы в игровом меню можно добавить позже; для прототипа достаточно возможности настроить её при разработке.</w:t>
-      </w:r>
-    </w:p>
-    <w:p>
-      <w:pPr>
-        <w:pStyle w:val="Heading2"/>
-      </w:pPr>
-      <w:r>
-        <w:t>Критерий понятности</w:t>
-      </w:r>
-    </w:p>
-    <w:p>
-      <w:r>
-        <w:t>Игрок без объяснения команды различает покупку кофе и употребление, понимает цену еды и знает, что сон сам по себе не лечит. Все платные действия показывают стоимость до нажатия. Наведение никогда не тратит деньги.</w:t>
-      </w:r>
-    </w:p>
-    <w:p>
-      <w:r>
-        <w:br w:type="page"/>
+        <w:t>Полноценное 3D, свободное перемещение, ручной ввод заголовков, большая сюжетная кампания, новые системы прокачки. Они расширяют проект сильнее, чем помогают проверить основной цикл.</w:t>
       </w:r>
     </w:p>
     <w:p>
@@ -1253,2703 +844,22 @@
         <w:pStyle w:val="Heading1"/>
       </w:pPr>
       <w:r>
-        <w:t>4 Контент и длина прототипа</w:t>
-      </w:r>
-    </w:p>
-    <w:p>
-      <w:pPr>
-        <w:pStyle w:val="Heading2"/>
-      </w:pPr>
-      <w:r>
-        <w:t>Объём</w:t>
+        <w:t>С чего начинаем</w:t>
       </w:r>
     </w:p>
     <w:p>
       <w:r>
-        <w:t>Используем существующие 32 материала и 96 заголовков. Восемь историй пришли из таблицы команды; восемь исходных материалов содержат особенно жёсткие штрафы. Сначала редактируем существующий набор. Большое расширение контента не входит в обязательный объём.</w:t>
-      </w:r>
-    </w:p>
-    <w:p>
-      <w:r>
-        <w:t>Сюжетная упаковка — короткий монолог героини, четыре страницы инструктажа и четыре концовки. Продолжения историй сохраняют порядок. Новые персонажи не требуют отдельных моделей поведения или диалоговых веток.</w:t>
-      </w:r>
-    </w:p>
-    <w:tbl>
-      <w:tblPr>
-        <w:tblW w:type="auto" w:w="0"/>
-        <w:jc w:val="center"/>
-        <w:tblLayout w:type="fixed"/>
-        <w:tblLook w:firstColumn="1" w:firstRow="1" w:lastColumn="0" w:lastRow="0" w:noHBand="0" w:noVBand="1" w:val="04A0"/>
-        <w:tblBorders>
-          <w:top w:val="single" w:sz="4" w:color="D9D9D9"/>
-          <w:left w:val="single" w:sz="4" w:color="D9D9D9"/>
-          <w:bottom w:val="single" w:sz="4" w:color="D9D9D9"/>
-          <w:right w:val="single" w:sz="4" w:color="D9D9D9"/>
-          <w:insideH w:val="single" w:sz="4" w:color="D9D9D9"/>
-          <w:insideV w:val="single" w:sz="4" w:color="D9D9D9"/>
-        </w:tblBorders>
-      </w:tblPr>
-      <w:tblGrid>
-        <w:gridCol w:w="2923"/>
-        <w:gridCol w:w="7243"/>
-      </w:tblGrid>
-      <w:tr>
-        <w:trPr>
-          <w:cantSplit/>
-          <w:tblHeader/>
-        </w:trPr>
-        <w:tc>
-          <w:tcPr>
-            <w:tcW w:type="dxa" w:w="2923"/>
-            <w:vAlign w:val="center"/>
-            <w:shd w:fill="243B48"/>
-            <w:tcMar>
-              <w:top w:w="85" w:type="dxa"/>
-              <w:left w:w="85" w:type="dxa"/>
-              <w:bottom w:w="85" w:type="dxa"/>
-              <w:right w:w="85" w:type="dxa"/>
-            </w:tcMar>
-          </w:tcPr>
-          <w:p>
-            <w:pPr>
-              <w:spacing w:after="0" w:line="247" w:lineRule="auto"/>
-            </w:pPr>
-            <w:r>
-              <w:rPr>
-                <w:b/>
-                <w:color w:val="FFFFFF"/>
-                <w:sz w:val="21"/>
-              </w:rPr>
-              <w:t>Часть материала</w:t>
-            </w:r>
-          </w:p>
-        </w:tc>
-        <w:tc>
-          <w:tcPr>
-            <w:tcW w:type="dxa" w:w="7243"/>
-            <w:vAlign w:val="center"/>
-            <w:shd w:fill="243B48"/>
-            <w:tcMar>
-              <w:top w:w="85" w:type="dxa"/>
-              <w:left w:w="85" w:type="dxa"/>
-              <w:bottom w:w="85" w:type="dxa"/>
-              <w:right w:w="85" w:type="dxa"/>
-            </w:tcMar>
-          </w:tcPr>
-          <w:p>
-            <w:pPr>
-              <w:spacing w:after="0" w:line="247" w:lineRule="auto"/>
-            </w:pPr>
-            <w:r>
-              <w:rPr>
-                <w:b/>
-                <w:color w:val="FFFFFF"/>
-                <w:sz w:val="21"/>
-              </w:rPr>
-              <w:t>Что должно быть понятно</w:t>
-            </w:r>
-          </w:p>
-        </w:tc>
-      </w:tr>
-      <w:tr>
-        <w:trPr>
-          <w:cantSplit/>
-        </w:trPr>
-        <w:tc>
-          <w:tcPr>
-            <w:tcW w:type="dxa" w:w="2923"/>
-            <w:vAlign w:val="center"/>
-            <w:shd w:fill="F2F5F7"/>
-            <w:tcMar>
-              <w:top w:w="85" w:type="dxa"/>
-              <w:left w:w="85" w:type="dxa"/>
-              <w:bottom w:w="85" w:type="dxa"/>
-              <w:right w:w="85" w:type="dxa"/>
-            </w:tcMar>
-          </w:tcPr>
-          <w:p>
-            <w:pPr>
-              <w:spacing w:after="0" w:line="247" w:lineRule="auto"/>
-            </w:pPr>
-            <w:r>
-              <w:rPr>
-                <w:sz w:val="21"/>
-              </w:rPr>
-              <w:t>Источник</w:t>
-            </w:r>
-          </w:p>
-        </w:tc>
-        <w:tc>
-          <w:tcPr>
-            <w:tcW w:type="dxa" w:w="7243"/>
-            <w:vAlign w:val="center"/>
-            <w:shd w:fill="F2F5F7"/>
-            <w:tcMar>
-              <w:top w:w="85" w:type="dxa"/>
-              <w:left w:w="85" w:type="dxa"/>
-              <w:bottom w:w="85" w:type="dxa"/>
-              <w:right w:w="85" w:type="dxa"/>
-            </w:tcMar>
-          </w:tcPr>
-          <w:p>
-            <w:pPr>
-              <w:spacing w:after="0" w:line="247" w:lineRule="auto"/>
-            </w:pPr>
-            <w:r>
-              <w:rPr>
-                <w:sz w:val="21"/>
-              </w:rPr>
-              <w:t>Кто сообщил сведения, что действительно известно и что остаётся предположением.</w:t>
-            </w:r>
-          </w:p>
-        </w:tc>
-      </w:tr>
-      <w:tr>
-        <w:trPr>
-          <w:cantSplit/>
-        </w:trPr>
-        <w:tc>
-          <w:tcPr>
-            <w:tcW w:type="dxa" w:w="2923"/>
-            <w:vAlign w:val="center"/>
-            <w:shd w:fill="FFFFFF"/>
-            <w:tcMar>
-              <w:top w:w="85" w:type="dxa"/>
-              <w:left w:w="85" w:type="dxa"/>
-              <w:bottom w:w="85" w:type="dxa"/>
-              <w:right w:w="85" w:type="dxa"/>
-            </w:tcMar>
-          </w:tcPr>
-          <w:p>
-            <w:pPr>
-              <w:spacing w:after="0" w:line="247" w:lineRule="auto"/>
-            </w:pPr>
-            <w:r>
-              <w:rPr>
-                <w:sz w:val="21"/>
-              </w:rPr>
-              <w:t>Три заголовка</w:t>
-            </w:r>
-          </w:p>
-        </w:tc>
-        <w:tc>
-          <w:tcPr>
-            <w:tcW w:type="dxa" w:w="7243"/>
-            <w:vAlign w:val="center"/>
-            <w:shd w:fill="FFFFFF"/>
-            <w:tcMar>
-              <w:top w:w="85" w:type="dxa"/>
-              <w:left w:w="85" w:type="dxa"/>
-              <w:bottom w:w="85" w:type="dxa"/>
-              <w:right w:w="85" w:type="dxa"/>
-            </w:tcMar>
-          </w:tcPr>
-          <w:p>
-            <w:pPr>
-              <w:spacing w:after="0" w:line="247" w:lineRule="auto"/>
-            </w:pPr>
-            <w:r>
-              <w:rPr>
-                <w:sz w:val="21"/>
-              </w:rPr>
-              <w:t>Чем варианты отличаются по смыслу и подаче; в чём конкретно может состоять искажение.</w:t>
-            </w:r>
-          </w:p>
-        </w:tc>
-      </w:tr>
-      <w:tr>
-        <w:trPr>
-          <w:cantSplit/>
-        </w:trPr>
-        <w:tc>
-          <w:tcPr>
-            <w:tcW w:type="dxa" w:w="2923"/>
-            <w:vAlign w:val="center"/>
-            <w:shd w:fill="F2F5F7"/>
-            <w:tcMar>
-              <w:top w:w="85" w:type="dxa"/>
-              <w:left w:w="85" w:type="dxa"/>
-              <w:bottom w:w="85" w:type="dxa"/>
-              <w:right w:w="85" w:type="dxa"/>
-            </w:tcMar>
-          </w:tcPr>
-          <w:p>
-            <w:pPr>
-              <w:spacing w:after="0" w:line="247" w:lineRule="auto"/>
-            </w:pPr>
-            <w:r>
-              <w:rPr>
-                <w:sz w:val="21"/>
-              </w:rPr>
-              <w:t>Последствия</w:t>
-            </w:r>
-          </w:p>
-        </w:tc>
-        <w:tc>
-          <w:tcPr>
-            <w:tcW w:type="dxa" w:w="7243"/>
-            <w:vAlign w:val="center"/>
-            <w:shd w:fill="F2F5F7"/>
-            <w:tcMar>
-              <w:top w:w="85" w:type="dxa"/>
-              <w:left w:w="85" w:type="dxa"/>
-              <w:bottom w:w="85" w:type="dxa"/>
-              <w:right w:w="85" w:type="dxa"/>
-            </w:tcMar>
-          </w:tcPr>
-          <w:p>
-            <w:pPr>
-              <w:spacing w:after="0" w:line="247" w:lineRule="auto"/>
-            </w:pPr>
-            <w:r>
-              <w:rPr>
-                <w:sz w:val="21"/>
-              </w:rPr>
-              <w:t>Почему меняются доход, доверие и отношение государства; чем опасно усиление через комбо.</w:t>
-            </w:r>
-          </w:p>
-        </w:tc>
-      </w:tr>
-      <w:tr>
-        <w:trPr>
-          <w:cantSplit/>
-        </w:trPr>
-        <w:tc>
-          <w:tcPr>
-            <w:tcW w:type="dxa" w:w="2923"/>
-            <w:vAlign w:val="center"/>
-            <w:shd w:fill="FFFFFF"/>
-            <w:tcMar>
-              <w:top w:w="85" w:type="dxa"/>
-              <w:left w:w="85" w:type="dxa"/>
-              <w:bottom w:w="85" w:type="dxa"/>
-              <w:right w:w="85" w:type="dxa"/>
-            </w:tcMar>
-          </w:tcPr>
-          <w:p>
-            <w:pPr>
-              <w:spacing w:after="0" w:line="247" w:lineRule="auto"/>
-            </w:pPr>
-            <w:r>
-              <w:rPr>
-                <w:sz w:val="21"/>
-              </w:rPr>
-              <w:t>Объяснение результата</w:t>
-            </w:r>
-          </w:p>
-        </w:tc>
-        <w:tc>
-          <w:tcPr>
-            <w:tcW w:type="dxa" w:w="7243"/>
-            <w:vAlign w:val="center"/>
-            <w:shd w:fill="FFFFFF"/>
-            <w:tcMar>
-              <w:top w:w="85" w:type="dxa"/>
-              <w:left w:w="85" w:type="dxa"/>
-              <w:bottom w:w="85" w:type="dxa"/>
-              <w:right w:w="85" w:type="dxa"/>
-            </w:tcMar>
-          </w:tcPr>
-          <w:p>
-            <w:pPr>
-              <w:spacing w:after="0" w:line="247" w:lineRule="auto"/>
-            </w:pPr>
-            <w:r>
-              <w:rPr>
-                <w:sz w:val="21"/>
-              </w:rPr>
-              <w:t>Краткая связь выбранной формулировки с последствиями, а не просто сообщение «верно» или «неверно».</w:t>
-            </w:r>
-          </w:p>
-        </w:tc>
-      </w:tr>
-    </w:tbl>
-    <w:p>
-      <w:pPr>
-        <w:spacing w:after="0"/>
-      </w:pPr>
-    </w:p>
-    <w:p>
-      <w:pPr>
-        <w:pStyle w:val="Heading2"/>
-      </w:pPr>
-      <w:r>
-        <w:t>Редакторский принцип</w:t>
-      </w:r>
-    </w:p>
-    <w:p>
-      <w:r>
-        <w:t>Не превращаем игру в угадывание мнения автора. Ошибка должна быть объяснима через источник: неподтверждённый слух, потерю контекста, преувеличение, подмену причины или выдуманную подробность. Поддержка власти не означает правду, а критика не означает дезинформацию.</w:t>
-      </w:r>
-    </w:p>
-    <w:p>
-      <w:r>
-        <w:t>Предлагаемый ориентир для обычного источника — одно-три коротких предложения. Более длинные тексты допускаем там, где они дают интересное решение. Заголовки должны помещаться в карточки и быстро сравниваться. Единый уровень грубой лексики и сатиры согласуем до финальной вычитки.</w:t>
-      </w:r>
-    </w:p>
-    <w:p>
-      <w:pPr>
-        <w:pStyle w:val="Heading2"/>
-      </w:pPr>
-      <w:r>
-        <w:t>Продолжительность</w:t>
-      </w:r>
-    </w:p>
-    <w:p>
-      <w:r>
-        <w:t>Сейчас игра идёт по дням до проигрыша, а после 32-го материала каталог повторяется. Лимит десять публикаций в день замедляет расход, но сам по себе не исключает повторения.</w:t>
-      </w:r>
-    </w:p>
-    <w:p>
-      <w:r>
-        <w:t>Для демонстрации предлагаем ориентироваться на первые три смены: за них игрок увидит не более 30 материалов и успеет пройти цикл несколько раз. Решение об автоматическом завершении после третьего дня и отдельном успешном финале ещё нужно согласовать. Это не часть уже реализованного цикла.</w:t>
-      </w:r>
-    </w:p>
-    <w:p>
-      <w:pPr>
-        <w:pStyle w:val="Heading2"/>
-      </w:pPr>
-      <w:r>
-        <w:t>Первый вопрос плейтеста</w:t>
-      </w:r>
-    </w:p>
-    <w:p>
-      <w:r>
-        <w:t>Интересно ли игроку выбирать заголовок после знакомства с источником? Если нет, сначала меняем качество самих решений и объяснений. Дополнительная графика и новые системы не должны скрывать слабость основного выбора.</w:t>
-      </w:r>
-    </w:p>
-    <w:p>
-      <w:r>
-        <w:br w:type="page"/>
-      </w:r>
-    </w:p>
-    <w:p>
-      <w:pPr>
-        <w:pStyle w:val="Heading1"/>
-      </w:pPr>
-      <w:r>
-        <w:t>5 Задание для UX и UI дизайнера</w:t>
-      </w:r>
-    </w:p>
-    <w:p>
-      <w:r>
-        <w:t>UX/UI дизайнер отвечает за понятность действий, компоновку экранов, читаемость и состояния элементов. Художник создаёт предметы и окружение; дизайнер определяет, как игрок ими пользуется и какую информацию видит.</w:t>
-      </w:r>
-    </w:p>
-    <w:tbl>
-      <w:tblPr>
-        <w:tblW w:type="auto" w:w="0"/>
-        <w:jc w:val="center"/>
-        <w:tblLayout w:type="fixed"/>
-        <w:tblLook w:firstColumn="1" w:firstRow="1" w:lastColumn="0" w:lastRow="0" w:noHBand="0" w:noVBand="1" w:val="04A0"/>
-        <w:tblBorders>
-          <w:top w:val="single" w:sz="4" w:color="D9D9D9"/>
-          <w:left w:val="single" w:sz="4" w:color="D9D9D9"/>
-          <w:bottom w:val="single" w:sz="4" w:color="D9D9D9"/>
-          <w:right w:val="single" w:sz="4" w:color="D9D9D9"/>
-          <w:insideH w:val="single" w:sz="4" w:color="D9D9D9"/>
-          <w:insideV w:val="single" w:sz="4" w:color="D9D9D9"/>
-        </w:tblBorders>
-      </w:tblPr>
-      <w:tblGrid>
-        <w:gridCol w:w="2923"/>
-        <w:gridCol w:w="7243"/>
-      </w:tblGrid>
-      <w:tr>
-        <w:trPr>
-          <w:cantSplit/>
-          <w:tblHeader/>
-        </w:trPr>
-        <w:tc>
-          <w:tcPr>
-            <w:tcW w:type="dxa" w:w="2923"/>
-            <w:vAlign w:val="center"/>
-            <w:shd w:fill="243B48"/>
-            <w:tcMar>
-              <w:top w:w="85" w:type="dxa"/>
-              <w:left w:w="85" w:type="dxa"/>
-              <w:bottom w:w="85" w:type="dxa"/>
-              <w:right w:w="85" w:type="dxa"/>
-            </w:tcMar>
-          </w:tcPr>
-          <w:p>
-            <w:pPr>
-              <w:spacing w:after="0" w:line="247" w:lineRule="auto"/>
-            </w:pPr>
-            <w:r>
-              <w:rPr>
-                <w:b/>
-                <w:color w:val="FFFFFF"/>
-                <w:sz w:val="21"/>
-              </w:rPr>
-              <w:t>Экран</w:t>
-            </w:r>
-          </w:p>
-        </w:tc>
-        <w:tc>
-          <w:tcPr>
-            <w:tcW w:type="dxa" w:w="7243"/>
-            <w:vAlign w:val="center"/>
-            <w:shd w:fill="243B48"/>
-            <w:tcMar>
-              <w:top w:w="85" w:type="dxa"/>
-              <w:left w:w="85" w:type="dxa"/>
-              <w:bottom w:w="85" w:type="dxa"/>
-              <w:right w:w="85" w:type="dxa"/>
-            </w:tcMar>
-          </w:tcPr>
-          <w:p>
-            <w:pPr>
-              <w:spacing w:after="0" w:line="247" w:lineRule="auto"/>
-            </w:pPr>
-            <w:r>
-              <w:rPr>
-                <w:b/>
-                <w:color w:val="FFFFFF"/>
-                <w:sz w:val="21"/>
-              </w:rPr>
-              <w:t>Что требуется</w:t>
-            </w:r>
-          </w:p>
-        </w:tc>
-      </w:tr>
-      <w:tr>
-        <w:trPr>
-          <w:cantSplit/>
-        </w:trPr>
-        <w:tc>
-          <w:tcPr>
-            <w:tcW w:type="dxa" w:w="2923"/>
-            <w:vAlign w:val="center"/>
-            <w:shd w:fill="F2F5F7"/>
-            <w:tcMar>
-              <w:top w:w="85" w:type="dxa"/>
-              <w:left w:w="85" w:type="dxa"/>
-              <w:bottom w:w="85" w:type="dxa"/>
-              <w:right w:w="85" w:type="dxa"/>
-            </w:tcMar>
-          </w:tcPr>
-          <w:p>
-            <w:pPr>
-              <w:spacing w:after="0" w:line="247" w:lineRule="auto"/>
-            </w:pPr>
-            <w:r>
-              <w:rPr>
-                <w:sz w:val="21"/>
-              </w:rPr>
-              <w:t>Меню и обучение</w:t>
-            </w:r>
-          </w:p>
-        </w:tc>
-        <w:tc>
-          <w:tcPr>
-            <w:tcW w:type="dxa" w:w="7243"/>
-            <w:vAlign w:val="center"/>
-            <w:shd w:fill="F2F5F7"/>
-            <w:tcMar>
-              <w:top w:w="85" w:type="dxa"/>
-              <w:left w:w="85" w:type="dxa"/>
-              <w:bottom w:w="85" w:type="dxa"/>
-              <w:right w:w="85" w:type="dxa"/>
-            </w:tcMar>
-          </w:tcPr>
-          <w:p>
-            <w:pPr>
-              <w:spacing w:after="0" w:line="247" w:lineRule="auto"/>
-            </w:pPr>
-            <w:r>
-              <w:rPr>
-                <w:sz w:val="21"/>
-              </w:rPr>
-              <w:t>Начать, выйти, пропустить вступление; быстро объяснить цель и цикл работы.</w:t>
-            </w:r>
-          </w:p>
-        </w:tc>
-      </w:tr>
-      <w:tr>
-        <w:trPr>
-          <w:cantSplit/>
-        </w:trPr>
-        <w:tc>
-          <w:tcPr>
-            <w:tcW w:type="dxa" w:w="2923"/>
-            <w:vAlign w:val="center"/>
-            <w:shd w:fill="FFFFFF"/>
-            <w:tcMar>
-              <w:top w:w="85" w:type="dxa"/>
-              <w:left w:w="85" w:type="dxa"/>
-              <w:bottom w:w="85" w:type="dxa"/>
-              <w:right w:w="85" w:type="dxa"/>
-            </w:tcMar>
-          </w:tcPr>
-          <w:p>
-            <w:pPr>
-              <w:spacing w:after="0" w:line="247" w:lineRule="auto"/>
-            </w:pPr>
-            <w:r>
-              <w:rPr>
-                <w:sz w:val="21"/>
-              </w:rPr>
-              <w:t>Рабочий стол</w:t>
-            </w:r>
-          </w:p>
-        </w:tc>
-        <w:tc>
-          <w:tcPr>
-            <w:tcW w:type="dxa" w:w="7243"/>
-            <w:vAlign w:val="center"/>
-            <w:shd w:fill="FFFFFF"/>
-            <w:tcMar>
-              <w:top w:w="85" w:type="dxa"/>
-              <w:left w:w="85" w:type="dxa"/>
-              <w:bottom w:w="85" w:type="dxa"/>
-              <w:right w:w="85" w:type="dxa"/>
-            </w:tcMar>
-          </w:tcPr>
-          <w:p>
-            <w:pPr>
-              <w:spacing w:after="0" w:line="247" w:lineRule="auto"/>
-            </w:pPr>
-            <w:r>
-              <w:rPr>
-                <w:sz w:val="21"/>
-              </w:rPr>
-              <w:t>Три шкалы, деньги, день, таймер и публикации N / 10; источник, карточки, комбо, кофе и сдача выпуска.</w:t>
-            </w:r>
-          </w:p>
-        </w:tc>
-      </w:tr>
-      <w:tr>
-        <w:trPr>
-          <w:cantSplit/>
-        </w:trPr>
-        <w:tc>
-          <w:tcPr>
-            <w:tcW w:type="dxa" w:w="2923"/>
-            <w:vAlign w:val="center"/>
-            <w:shd w:fill="F2F5F7"/>
-            <w:tcMar>
-              <w:top w:w="85" w:type="dxa"/>
-              <w:left w:w="85" w:type="dxa"/>
-              <w:bottom w:w="85" w:type="dxa"/>
-              <w:right w:w="85" w:type="dxa"/>
-            </w:tcMar>
-          </w:tcPr>
-          <w:p>
-            <w:pPr>
-              <w:spacing w:after="0" w:line="247" w:lineRule="auto"/>
-            </w:pPr>
-            <w:r>
-              <w:rPr>
-                <w:sz w:val="21"/>
-              </w:rPr>
-              <w:t>Источник и подтверждение</w:t>
-            </w:r>
-          </w:p>
-        </w:tc>
-        <w:tc>
-          <w:tcPr>
-            <w:tcW w:type="dxa" w:w="7243"/>
-            <w:vAlign w:val="center"/>
-            <w:shd w:fill="F2F5F7"/>
-            <w:tcMar>
-              <w:top w:w="85" w:type="dxa"/>
-              <w:left w:w="85" w:type="dxa"/>
-              <w:bottom w:w="85" w:type="dxa"/>
-              <w:right w:w="85" w:type="dxa"/>
-            </w:tcMar>
-          </w:tcPr>
-          <w:p>
-            <w:pPr>
-              <w:spacing w:after="0" w:line="247" w:lineRule="auto"/>
-            </w:pPr>
-            <w:r>
-              <w:rPr>
-                <w:sz w:val="21"/>
-              </w:rPr>
-              <w:t>Читаемый текст; свернуть и перечитать; выбранный заголовок; напечатать или вернуться.</w:t>
-            </w:r>
-          </w:p>
-        </w:tc>
-      </w:tr>
-      <w:tr>
-        <w:trPr>
-          <w:cantSplit/>
-        </w:trPr>
-        <w:tc>
-          <w:tcPr>
-            <w:tcW w:type="dxa" w:w="2923"/>
-            <w:vAlign w:val="center"/>
-            <w:shd w:fill="FFFFFF"/>
-            <w:tcMar>
-              <w:top w:w="85" w:type="dxa"/>
-              <w:left w:w="85" w:type="dxa"/>
-              <w:bottom w:w="85" w:type="dxa"/>
-              <w:right w:w="85" w:type="dxa"/>
-            </w:tcMar>
-          </w:tcPr>
-          <w:p>
-            <w:pPr>
-              <w:spacing w:after="0" w:line="247" w:lineRule="auto"/>
-            </w:pPr>
-            <w:r>
-              <w:rPr>
-                <w:sz w:val="21"/>
-              </w:rPr>
-              <w:t>Результат публикации</w:t>
-            </w:r>
-          </w:p>
-        </w:tc>
-        <w:tc>
-          <w:tcPr>
-            <w:tcW w:type="dxa" w:w="7243"/>
-            <w:vAlign w:val="center"/>
-            <w:shd w:fill="FFFFFF"/>
-            <w:tcMar>
-              <w:top w:w="85" w:type="dxa"/>
-              <w:left w:w="85" w:type="dxa"/>
-              <w:bottom w:w="85" w:type="dxa"/>
-              <w:right w:w="85" w:type="dxa"/>
-            </w:tcMar>
-          </w:tcPr>
-          <w:p>
-            <w:pPr>
-              <w:spacing w:after="0" w:line="247" w:lineRule="auto"/>
-            </w:pPr>
-            <w:r>
-              <w:rPr>
-                <w:sz w:val="21"/>
-              </w:rPr>
-              <w:t>Изменения показателей, объяснение, серия. При полном выпуске — сообщение и переход домой.</w:t>
-            </w:r>
-          </w:p>
-        </w:tc>
-      </w:tr>
-      <w:tr>
-        <w:trPr>
-          <w:cantSplit/>
-        </w:trPr>
-        <w:tc>
-          <w:tcPr>
-            <w:tcW w:type="dxa" w:w="2923"/>
-            <w:vAlign w:val="center"/>
-            <w:shd w:fill="F2F5F7"/>
-            <w:tcMar>
-              <w:top w:w="85" w:type="dxa"/>
-              <w:left w:w="85" w:type="dxa"/>
-              <w:bottom w:w="85" w:type="dxa"/>
-              <w:right w:w="85" w:type="dxa"/>
-            </w:tcMar>
-          </w:tcPr>
-          <w:p>
-            <w:pPr>
-              <w:spacing w:after="0" w:line="247" w:lineRule="auto"/>
-            </w:pPr>
-            <w:r>
-              <w:rPr>
-                <w:sz w:val="21"/>
-              </w:rPr>
-              <w:t>Дом</w:t>
-            </w:r>
-          </w:p>
-        </w:tc>
-        <w:tc>
-          <w:tcPr>
-            <w:tcW w:type="dxa" w:w="7243"/>
-            <w:vAlign w:val="center"/>
-            <w:shd w:fill="F2F5F7"/>
-            <w:tcMar>
-              <w:top w:w="85" w:type="dxa"/>
-              <w:left w:w="85" w:type="dxa"/>
-              <w:bottom w:w="85" w:type="dxa"/>
-              <w:right w:w="85" w:type="dxa"/>
-            </w:tcMar>
-          </w:tcPr>
-          <w:p>
-            <w:pPr>
-              <w:spacing w:after="0" w:line="247" w:lineRule="auto"/>
-            </w:pPr>
-            <w:r>
-              <w:rPr>
-                <w:sz w:val="21"/>
-              </w:rPr>
-              <w:t>Итоги смены, цены и эффекты еды и кофе, понятное действие сна.</w:t>
-            </w:r>
-          </w:p>
-        </w:tc>
-      </w:tr>
-      <w:tr>
-        <w:trPr>
-          <w:cantSplit/>
-        </w:trPr>
-        <w:tc>
-          <w:tcPr>
-            <w:tcW w:type="dxa" w:w="2923"/>
-            <w:vAlign w:val="center"/>
-            <w:shd w:fill="FFFFFF"/>
-            <w:tcMar>
-              <w:top w:w="85" w:type="dxa"/>
-              <w:left w:w="85" w:type="dxa"/>
-              <w:bottom w:w="85" w:type="dxa"/>
-              <w:right w:w="85" w:type="dxa"/>
-            </w:tcMar>
-          </w:tcPr>
-          <w:p>
-            <w:pPr>
-              <w:spacing w:after="0" w:line="247" w:lineRule="auto"/>
-            </w:pPr>
-            <w:r>
-              <w:rPr>
-                <w:sz w:val="21"/>
-              </w:rPr>
-              <w:t>Пауза и концовки</w:t>
-            </w:r>
-          </w:p>
-        </w:tc>
-        <w:tc>
-          <w:tcPr>
-            <w:tcW w:type="dxa" w:w="7243"/>
-            <w:vAlign w:val="center"/>
-            <w:shd w:fill="FFFFFF"/>
-            <w:tcMar>
-              <w:top w:w="85" w:type="dxa"/>
-              <w:left w:w="85" w:type="dxa"/>
-              <w:bottom w:w="85" w:type="dxa"/>
-              <w:right w:w="85" w:type="dxa"/>
-            </w:tcMar>
-          </w:tcPr>
-          <w:p>
-            <w:pPr>
-              <w:spacing w:after="0" w:line="247" w:lineRule="auto"/>
-            </w:pPr>
-            <w:r>
-              <w:rPr>
-                <w:sz w:val="21"/>
-              </w:rPr>
-              <w:t>Продолжить или выйти; причина проигрыша, итоги и перезапуск. Единый шаблон четырёх концовок.</w:t>
-            </w:r>
-          </w:p>
-        </w:tc>
-      </w:tr>
-    </w:tbl>
-    <w:p>
-      <w:pPr>
-        <w:spacing w:after="0"/>
-      </w:pPr>
-    </w:p>
-    <w:p>
-      <w:pPr>
-        <w:pStyle w:val="Heading2"/>
-      </w:pPr>
-      <w:r>
-        <w:t>Состояния</w:t>
-      </w:r>
-    </w:p>
-    <w:p>
-      <w:r>
-        <w:t>Для кнопок нужны обычное состояние, наведение, нажатие, фокус клавиатуры и недоступность. Для предметов — закрытая и открытая записка, закрытый и открытый холодильник, продукты внутри, купленный кофе и состояние сна.</w:t>
-      </w:r>
-    </w:p>
-    <w:p>
-      <w:r>
-        <w:t>Цена видна до покупки. Недоступность объясняется короткой подписью, например «Вы сыты» или «Кофе упакован». Окна закрывают взаимодействие с предметами позади. Состояния не должны различаться только цветом.</w:t>
-      </w:r>
-    </w:p>
-    <w:p>
-      <w:pPr>
-        <w:pStyle w:val="Heading2"/>
-      </w:pPr>
-      <w:r>
-        <w:t>Результат работы</w:t>
-      </w:r>
-    </w:p>
-    <w:p>
-      <w:r>
-        <w:t>Макеты основных экранов в Full HD, набор повторно используемых компонентов и простой прототип маршрута одной публикации и одного вечера. Для окон и предметов подписаны действия и переходы. Компоновка должна выдерживать длинные заголовки и изменения чисел.</w:t>
-      </w:r>
-    </w:p>
-    <w:p>
-      <w:r>
-        <w:t>Размеры и расположение интерактивных объектов согласуются с художником до чистовой отрисовки. Разработчик подтверждает, что предложенное поведение укладывается в существующую механику.</w:t>
-      </w:r>
-    </w:p>
-    <w:p>
-      <w:pPr>
-        <w:pStyle w:val="Heading2"/>
-      </w:pPr>
-      <w:r>
-        <w:t>Приёмка</w:t>
-      </w:r>
-    </w:p>
-    <w:p>
-      <w:r>
-        <w:t>Новый игрок самостоятельно находит источник, публикует материал, понимает последствия и проходит вечер. Читаемость проверяется на фоне реальной графики и с эффектом усталости. Итог принимается в игре, а не только по красивому макету.</w:t>
-      </w:r>
-    </w:p>
-    <w:p>
-      <w:r>
-        <w:br w:type="page"/>
-      </w:r>
-    </w:p>
-    <w:p>
-      <w:pPr>
-        <w:pStyle w:val="Heading1"/>
-      </w:pPr>
-      <w:r>
-        <w:t>6 Задание для художника</w:t>
-      </w:r>
-    </w:p>
-    <w:p>
-      <w:r>
-        <w:t>Визуальный объём ограничиваем двумя локациями, героиней, боссом и четырьмя простыми концовками. Редакция сохраняет рисованную подачу и псевдообъём, дом — пиксельную эстетику. Общая палитра и узнаваемая героиня связывают обе части.</w:t>
-      </w:r>
-    </w:p>
-    <w:tbl>
-      <w:tblPr>
-        <w:tblW w:type="auto" w:w="0"/>
-        <w:jc w:val="center"/>
-        <w:tblLayout w:type="fixed"/>
-        <w:tblLook w:firstColumn="1" w:firstRow="1" w:lastColumn="0" w:lastRow="0" w:noHBand="0" w:noVBand="1" w:val="04A0"/>
-        <w:tblBorders>
-          <w:top w:val="single" w:sz="4" w:color="D9D9D9"/>
-          <w:left w:val="single" w:sz="4" w:color="D9D9D9"/>
-          <w:bottom w:val="single" w:sz="4" w:color="D9D9D9"/>
-          <w:right w:val="single" w:sz="4" w:color="D9D9D9"/>
-          <w:insideH w:val="single" w:sz="4" w:color="D9D9D9"/>
-          <w:insideV w:val="single" w:sz="4" w:color="D9D9D9"/>
-        </w:tblBorders>
-      </w:tblPr>
-      <w:tblGrid>
-        <w:gridCol w:w="2376"/>
-        <w:gridCol w:w="7790"/>
-      </w:tblGrid>
-      <w:tr>
-        <w:trPr>
-          <w:cantSplit/>
-          <w:tblHeader/>
-        </w:trPr>
-        <w:tc>
-          <w:tcPr>
-            <w:tcW w:type="dxa" w:w="2376"/>
-            <w:vAlign w:val="center"/>
-            <w:shd w:fill="243B48"/>
-            <w:tcMar>
-              <w:top w:w="85" w:type="dxa"/>
-              <w:left w:w="85" w:type="dxa"/>
-              <w:bottom w:w="85" w:type="dxa"/>
-              <w:right w:w="85" w:type="dxa"/>
-            </w:tcMar>
-          </w:tcPr>
-          <w:p>
-            <w:pPr>
-              <w:spacing w:after="0" w:line="247" w:lineRule="auto"/>
-            </w:pPr>
-            <w:r>
-              <w:rPr>
-                <w:b/>
-                <w:color w:val="FFFFFF"/>
-                <w:sz w:val="21"/>
-              </w:rPr>
-              <w:t>Набор</w:t>
-            </w:r>
-          </w:p>
-        </w:tc>
-        <w:tc>
-          <w:tcPr>
-            <w:tcW w:type="dxa" w:w="7790"/>
-            <w:vAlign w:val="center"/>
-            <w:shd w:fill="243B48"/>
-            <w:tcMar>
-              <w:top w:w="85" w:type="dxa"/>
-              <w:left w:w="85" w:type="dxa"/>
-              <w:bottom w:w="85" w:type="dxa"/>
-              <w:right w:w="85" w:type="dxa"/>
-            </w:tcMar>
-          </w:tcPr>
-          <w:p>
-            <w:pPr>
-              <w:spacing w:after="0" w:line="247" w:lineRule="auto"/>
-            </w:pPr>
-            <w:r>
-              <w:rPr>
-                <w:b/>
-                <w:color w:val="FFFFFF"/>
-                <w:sz w:val="21"/>
-              </w:rPr>
-              <w:t>Минимальный состав</w:t>
-            </w:r>
-          </w:p>
-        </w:tc>
-      </w:tr>
-      <w:tr>
-        <w:trPr>
-          <w:cantSplit/>
-        </w:trPr>
-        <w:tc>
-          <w:tcPr>
-            <w:tcW w:type="dxa" w:w="2376"/>
-            <w:vAlign w:val="center"/>
-            <w:shd w:fill="F2F5F7"/>
-            <w:tcMar>
-              <w:top w:w="85" w:type="dxa"/>
-              <w:left w:w="85" w:type="dxa"/>
-              <w:bottom w:w="85" w:type="dxa"/>
-              <w:right w:w="85" w:type="dxa"/>
-            </w:tcMar>
-          </w:tcPr>
-          <w:p>
-            <w:pPr>
-              <w:spacing w:after="0" w:line="247" w:lineRule="auto"/>
-            </w:pPr>
-            <w:r>
-              <w:rPr>
-                <w:sz w:val="21"/>
-              </w:rPr>
-              <w:t>Редакция</w:t>
-            </w:r>
-          </w:p>
-        </w:tc>
-        <w:tc>
-          <w:tcPr>
-            <w:tcW w:type="dxa" w:w="7790"/>
-            <w:vAlign w:val="center"/>
-            <w:shd w:fill="F2F5F7"/>
-            <w:tcMar>
-              <w:top w:w="85" w:type="dxa"/>
-              <w:left w:w="85" w:type="dxa"/>
-              <w:bottom w:w="85" w:type="dxa"/>
-              <w:right w:w="85" w:type="dxa"/>
-            </w:tcMar>
-          </w:tcPr>
-          <w:p>
-            <w:pPr>
-              <w:spacing w:after="0" w:line="247" w:lineRule="auto"/>
-            </w:pPr>
-            <w:r>
-              <w:rPr>
-                <w:sz w:val="21"/>
-              </w:rPr>
-              <w:t>Фон стола; отдельные папка, записка, лист заголовка, чашка и бумага с кофейным следом.</w:t>
-            </w:r>
-          </w:p>
-        </w:tc>
-      </w:tr>
-      <w:tr>
-        <w:trPr>
-          <w:cantSplit/>
-        </w:trPr>
-        <w:tc>
-          <w:tcPr>
-            <w:tcW w:type="dxa" w:w="2376"/>
-            <w:vAlign w:val="center"/>
-            <w:shd w:fill="FFFFFF"/>
-            <w:tcMar>
-              <w:top w:w="85" w:type="dxa"/>
-              <w:left w:w="85" w:type="dxa"/>
-              <w:bottom w:w="85" w:type="dxa"/>
-              <w:right w:w="85" w:type="dxa"/>
-            </w:tcMar>
-          </w:tcPr>
-          <w:p>
-            <w:pPr>
-              <w:spacing w:after="0" w:line="247" w:lineRule="auto"/>
-            </w:pPr>
-            <w:r>
-              <w:rPr>
-                <w:sz w:val="21"/>
-              </w:rPr>
-              <w:t>Дом</w:t>
-            </w:r>
-          </w:p>
-        </w:tc>
-        <w:tc>
-          <w:tcPr>
-            <w:tcW w:type="dxa" w:w="7790"/>
-            <w:vAlign w:val="center"/>
-            <w:shd w:fill="FFFFFF"/>
-            <w:tcMar>
-              <w:top w:w="85" w:type="dxa"/>
-              <w:left w:w="85" w:type="dxa"/>
-              <w:bottom w:w="85" w:type="dxa"/>
-              <w:right w:w="85" w:type="dxa"/>
-            </w:tcMar>
-          </w:tcPr>
-          <w:p>
-            <w:pPr>
-              <w:spacing w:after="0" w:line="247" w:lineRule="auto"/>
-            </w:pPr>
-            <w:r>
-              <w:rPr>
-                <w:sz w:val="21"/>
-              </w:rPr>
-              <w:t>Фон комнаты; кровать, кухонный стол и холодильник; открытая дверца, продукты и чашка.</w:t>
-            </w:r>
-          </w:p>
-        </w:tc>
-      </w:tr>
-      <w:tr>
-        <w:trPr>
-          <w:cantSplit/>
-        </w:trPr>
-        <w:tc>
-          <w:tcPr>
-            <w:tcW w:type="dxa" w:w="2376"/>
-            <w:vAlign w:val="center"/>
-            <w:shd w:fill="F2F5F7"/>
-            <w:tcMar>
-              <w:top w:w="85" w:type="dxa"/>
-              <w:left w:w="85" w:type="dxa"/>
-              <w:bottom w:w="85" w:type="dxa"/>
-              <w:right w:w="85" w:type="dxa"/>
-            </w:tcMar>
-          </w:tcPr>
-          <w:p>
-            <w:pPr>
-              <w:spacing w:after="0" w:line="247" w:lineRule="auto"/>
-            </w:pPr>
-            <w:r>
-              <w:rPr>
-                <w:sz w:val="21"/>
-              </w:rPr>
-              <w:t>Героиня</w:t>
-            </w:r>
-          </w:p>
-        </w:tc>
-        <w:tc>
-          <w:tcPr>
-            <w:tcW w:type="dxa" w:w="7790"/>
-            <w:vAlign w:val="center"/>
-            <w:shd w:fill="F2F5F7"/>
-            <w:tcMar>
-              <w:top w:w="85" w:type="dxa"/>
-              <w:left w:w="85" w:type="dxa"/>
-              <w:bottom w:w="85" w:type="dxa"/>
-              <w:right w:w="85" w:type="dxa"/>
-            </w:tcMar>
-          </w:tcPr>
-          <w:p>
-            <w:pPr>
-              <w:spacing w:after="0" w:line="247" w:lineRule="auto"/>
-            </w:pPr>
-            <w:r>
-              <w:rPr>
-                <w:sz w:val="21"/>
-              </w:rPr>
-              <w:t>Один дизайн; спокойное, уставшее и спящее состояния. Для прототипа допустимы статичные позы.</w:t>
-            </w:r>
-          </w:p>
-        </w:tc>
-      </w:tr>
-      <w:tr>
-        <w:trPr>
-          <w:cantSplit/>
-        </w:trPr>
-        <w:tc>
-          <w:tcPr>
-            <w:tcW w:type="dxa" w:w="2376"/>
-            <w:vAlign w:val="center"/>
-            <w:shd w:fill="FFFFFF"/>
-            <w:tcMar>
-              <w:top w:w="85" w:type="dxa"/>
-              <w:left w:w="85" w:type="dxa"/>
-              <w:bottom w:w="85" w:type="dxa"/>
-              <w:right w:w="85" w:type="dxa"/>
-            </w:tcMar>
-          </w:tcPr>
-          <w:p>
-            <w:pPr>
-              <w:spacing w:after="0" w:line="247" w:lineRule="auto"/>
-            </w:pPr>
-            <w:r>
-              <w:rPr>
-                <w:sz w:val="21"/>
-              </w:rPr>
-              <w:t>Босс</w:t>
-            </w:r>
-          </w:p>
-        </w:tc>
-        <w:tc>
-          <w:tcPr>
-            <w:tcW w:type="dxa" w:w="7790"/>
-            <w:vAlign w:val="center"/>
-            <w:shd w:fill="FFFFFF"/>
-            <w:tcMar>
-              <w:top w:w="85" w:type="dxa"/>
-              <w:left w:w="85" w:type="dxa"/>
-              <w:bottom w:w="85" w:type="dxa"/>
-              <w:right w:w="85" w:type="dxa"/>
-            </w:tcMar>
-          </w:tcPr>
-          <w:p>
-            <w:pPr>
-              <w:spacing w:after="0" w:line="247" w:lineRule="auto"/>
-            </w:pPr>
-            <w:r>
-              <w:rPr>
-                <w:sz w:val="21"/>
-              </w:rPr>
-              <w:t>Один портрет или силуэт для инструктажа.</w:t>
-            </w:r>
-          </w:p>
-        </w:tc>
-      </w:tr>
-      <w:tr>
-        <w:trPr>
-          <w:cantSplit/>
-        </w:trPr>
-        <w:tc>
-          <w:tcPr>
-            <w:tcW w:type="dxa" w:w="2376"/>
-            <w:vAlign w:val="center"/>
-            <w:shd w:fill="F2F5F7"/>
-            <w:tcMar>
-              <w:top w:w="85" w:type="dxa"/>
-              <w:left w:w="85" w:type="dxa"/>
-              <w:bottom w:w="85" w:type="dxa"/>
-              <w:right w:w="85" w:type="dxa"/>
-            </w:tcMar>
-          </w:tcPr>
-          <w:p>
-            <w:pPr>
-              <w:spacing w:after="0" w:line="247" w:lineRule="auto"/>
-            </w:pPr>
-            <w:r>
-              <w:rPr>
-                <w:sz w:val="21"/>
-              </w:rPr>
-              <w:t>Концовки</w:t>
-            </w:r>
-          </w:p>
-        </w:tc>
-        <w:tc>
-          <w:tcPr>
-            <w:tcW w:type="dxa" w:w="7790"/>
-            <w:vAlign w:val="center"/>
-            <w:shd w:fill="F2F5F7"/>
-            <w:tcMar>
-              <w:top w:w="85" w:type="dxa"/>
-              <w:left w:w="85" w:type="dxa"/>
-              <w:bottom w:w="85" w:type="dxa"/>
-              <w:right w:w="85" w:type="dxa"/>
-            </w:tcMar>
-          </w:tcPr>
-          <w:p>
-            <w:pPr>
-              <w:spacing w:after="0" w:line="247" w:lineRule="auto"/>
-            </w:pPr>
-            <w:r>
-              <w:rPr>
-                <w:sz w:val="21"/>
-              </w:rPr>
-              <w:t>Четыре статичных мотива: истощение, пожар, арест и долги. Можно переиспользовать элементы.</w:t>
-            </w:r>
-          </w:p>
-        </w:tc>
-      </w:tr>
-      <w:tr>
-        <w:trPr>
-          <w:cantSplit/>
-        </w:trPr>
-        <w:tc>
-          <w:tcPr>
-            <w:tcW w:type="dxa" w:w="2376"/>
-            <w:vAlign w:val="center"/>
-            <w:shd w:fill="FFFFFF"/>
-            <w:tcMar>
-              <w:top w:w="85" w:type="dxa"/>
-              <w:left w:w="85" w:type="dxa"/>
-              <w:bottom w:w="85" w:type="dxa"/>
-              <w:right w:w="85" w:type="dxa"/>
-            </w:tcMar>
-          </w:tcPr>
-          <w:p>
-            <w:pPr>
-              <w:spacing w:after="0" w:line="247" w:lineRule="auto"/>
-            </w:pPr>
-            <w:r>
-              <w:rPr>
-                <w:sz w:val="21"/>
-              </w:rPr>
-              <w:t>Дополнительная анимация</w:t>
-            </w:r>
-          </w:p>
-        </w:tc>
-        <w:tc>
-          <w:tcPr>
-            <w:tcW w:type="dxa" w:w="7790"/>
-            <w:vAlign w:val="center"/>
-            <w:shd w:fill="FFFFFF"/>
-            <w:tcMar>
-              <w:top w:w="85" w:type="dxa"/>
-              <w:left w:w="85" w:type="dxa"/>
-              <w:bottom w:w="85" w:type="dxa"/>
-              <w:right w:w="85" w:type="dxa"/>
-            </w:tcMar>
-          </w:tcPr>
-          <w:p>
-            <w:pPr>
-              <w:spacing w:after="0" w:line="247" w:lineRule="auto"/>
-            </w:pPr>
-            <w:r>
-              <w:rPr>
-                <w:sz w:val="21"/>
-              </w:rPr>
-              <w:t>Моргание, дыхание, пар кофе и мелкие движения — после готовности основного набора.</w:t>
-            </w:r>
-          </w:p>
-        </w:tc>
-      </w:tr>
-    </w:tbl>
-    <w:p>
-      <w:pPr>
-        <w:spacing w:after="0"/>
-      </w:pPr>
-    </w:p>
-    <w:p>
-      <w:pPr>
-        <w:pStyle w:val="Heading2"/>
-      </w:pPr>
-      <w:r>
-        <w:t>Принципы подготовки</w:t>
-      </w:r>
-    </w:p>
-    <w:p>
-      <w:r>
-        <w:t>Не запекать текст, цены и шкалы в изображения. Кликабельные предметы передавать отдельно от фона. Размеры и свободные зоны определять вместе с UX/UI дизайнером до финального рисунка.</w:t>
-      </w:r>
-    </w:p>
-    <w:p>
-      <w:r>
-        <w:t>Сначала согласовать один образец рабочего стола, один образец комнаты и внешний вид героини. Для пиксельного дома выбрать единую сетку и проверить её масштабирование. Только после этого производить остальные состояния и кадры.</w:t>
-      </w:r>
-    </w:p>
-    <w:p>
-      <w:pPr>
-        <w:pStyle w:val="Heading2"/>
-      </w:pPr>
-      <w:r>
-        <w:t>Передача</w:t>
-      </w:r>
-    </w:p>
-    <w:p>
-      <w:r>
-        <w:t>Передавать исходники со слоями и отдельные изображения с прозрачностью. Для анимации указать порядок кадров и скорость. У состояний одного предмета сохранять одинаковый размер холста и точку привязки, чтобы при переключении предмет не прыгал.</w:t>
-      </w:r>
-    </w:p>
-    <w:p>
-      <w:r>
-        <w:t>За художественный результат отвечает художник. За импорт, зоны нажатия и связь с игровой логикой отвечает разработчик. UX/UI дизайнер проверяет, что предметы различимы и не спорят с интерфейсом.</w:t>
-      </w:r>
-    </w:p>
-    <w:p>
-      <w:pPr>
-        <w:pStyle w:val="Heading2"/>
-      </w:pPr>
-      <w:r>
-        <w:t>При нехватке времени</w:t>
-      </w:r>
-    </w:p>
-    <w:p>
-      <w:r>
-        <w:t>Оставить статичные состояния вместо сложных анимаций. Упростить пролог и меню, использовать готовые элементы для концовок. Приоритет — узнаваемые предметы, читаемый стол и понятные действия дома.</w:t>
-      </w:r>
-    </w:p>
-    <w:p>
-      <w:r>
-        <w:br w:type="page"/>
-      </w:r>
-    </w:p>
-    <w:p>
-      <w:pPr>
-        <w:pStyle w:val="Heading1"/>
-      </w:pPr>
-      <w:r>
-        <w:t>7 Разделение ответственности</w:t>
-      </w:r>
-    </w:p>
-    <w:p>
-      <w:r>
-        <w:t>Предлагаемая схема: ты совмещаешь разработку, геймдизайн и редактирование контента. Для каждой задачи нужен один ответственный за итог, даже если участвует вся команда.</w:t>
-      </w:r>
-    </w:p>
-    <w:tbl>
-      <w:tblPr>
-        <w:tblW w:type="auto" w:w="0"/>
-        <w:jc w:val="center"/>
-        <w:tblLayout w:type="fixed"/>
-        <w:tblLook w:firstColumn="1" w:firstRow="1" w:lastColumn="0" w:lastRow="0" w:noHBand="0" w:noVBand="1" w:val="04A0"/>
-        <w:tblBorders>
-          <w:top w:val="single" w:sz="4" w:color="D9D9D9"/>
-          <w:left w:val="single" w:sz="4" w:color="D9D9D9"/>
-          <w:bottom w:val="single" w:sz="4" w:color="D9D9D9"/>
-          <w:right w:val="single" w:sz="4" w:color="D9D9D9"/>
-          <w:insideH w:val="single" w:sz="4" w:color="D9D9D9"/>
-          <w:insideV w:val="single" w:sz="4" w:color="D9D9D9"/>
-        </w:tblBorders>
-      </w:tblPr>
-      <w:tblGrid>
-        <w:gridCol w:w="3024"/>
-        <w:gridCol w:w="2304"/>
-        <w:gridCol w:w="4838"/>
-      </w:tblGrid>
-      <w:tr>
-        <w:trPr>
-          <w:cantSplit/>
-          <w:tblHeader/>
-        </w:trPr>
-        <w:tc>
-          <w:tcPr>
-            <w:tcW w:type="dxa" w:w="3024"/>
-            <w:vAlign w:val="center"/>
-            <w:shd w:fill="243B48"/>
-            <w:tcMar>
-              <w:top w:w="85" w:type="dxa"/>
-              <w:left w:w="85" w:type="dxa"/>
-              <w:bottom w:w="85" w:type="dxa"/>
-              <w:right w:w="85" w:type="dxa"/>
-            </w:tcMar>
-          </w:tcPr>
-          <w:p>
-            <w:pPr>
-              <w:spacing w:after="0" w:line="247" w:lineRule="auto"/>
-            </w:pPr>
-            <w:r>
-              <w:rPr>
-                <w:b/>
-                <w:color w:val="FFFFFF"/>
-                <w:sz w:val="21"/>
-              </w:rPr>
-              <w:t>Направление</w:t>
-            </w:r>
-          </w:p>
-        </w:tc>
-        <w:tc>
-          <w:tcPr>
-            <w:tcW w:type="dxa" w:w="2304"/>
-            <w:vAlign w:val="center"/>
-            <w:shd w:fill="243B48"/>
-            <w:tcMar>
-              <w:top w:w="85" w:type="dxa"/>
-              <w:left w:w="85" w:type="dxa"/>
-              <w:bottom w:w="85" w:type="dxa"/>
-              <w:right w:w="85" w:type="dxa"/>
-            </w:tcMar>
-          </w:tcPr>
-          <w:p>
-            <w:pPr>
-              <w:spacing w:after="0" w:line="247" w:lineRule="auto"/>
-            </w:pPr>
-            <w:r>
-              <w:rPr>
-                <w:b/>
-                <w:color w:val="FFFFFF"/>
-                <w:sz w:val="21"/>
-              </w:rPr>
-              <w:t>Ответственный</w:t>
-            </w:r>
-          </w:p>
-        </w:tc>
-        <w:tc>
-          <w:tcPr>
-            <w:tcW w:type="dxa" w:w="4838"/>
-            <w:vAlign w:val="center"/>
-            <w:shd w:fill="243B48"/>
-            <w:tcMar>
-              <w:top w:w="85" w:type="dxa"/>
-              <w:left w:w="85" w:type="dxa"/>
-              <w:bottom w:w="85" w:type="dxa"/>
-              <w:right w:w="85" w:type="dxa"/>
-            </w:tcMar>
-          </w:tcPr>
-          <w:p>
-            <w:pPr>
-              <w:spacing w:after="0" w:line="247" w:lineRule="auto"/>
-            </w:pPr>
-            <w:r>
-              <w:rPr>
-                <w:b/>
-                <w:color w:val="FFFFFF"/>
-                <w:sz w:val="21"/>
-              </w:rPr>
-              <w:t>Участие остальных</w:t>
-            </w:r>
-          </w:p>
-        </w:tc>
-      </w:tr>
-      <w:tr>
-        <w:trPr>
-          <w:cantSplit/>
-        </w:trPr>
-        <w:tc>
-          <w:tcPr>
-            <w:tcW w:type="dxa" w:w="3024"/>
-            <w:vAlign w:val="center"/>
-            <w:shd w:fill="F2F5F7"/>
-            <w:tcMar>
-              <w:top w:w="85" w:type="dxa"/>
-              <w:left w:w="85" w:type="dxa"/>
-              <w:bottom w:w="85" w:type="dxa"/>
-              <w:right w:w="85" w:type="dxa"/>
-            </w:tcMar>
-          </w:tcPr>
-          <w:p>
-            <w:pPr>
-              <w:spacing w:after="0" w:line="247" w:lineRule="auto"/>
-            </w:pPr>
-            <w:r>
-              <w:rPr>
-                <w:sz w:val="21"/>
-              </w:rPr>
-              <w:t>Правила и объём проекта</w:t>
-            </w:r>
-          </w:p>
-        </w:tc>
-        <w:tc>
-          <w:tcPr>
-            <w:tcW w:type="dxa" w:w="2304"/>
-            <w:vAlign w:val="center"/>
-            <w:shd w:fill="F2F5F7"/>
-            <w:tcMar>
-              <w:top w:w="85" w:type="dxa"/>
-              <w:left w:w="85" w:type="dxa"/>
-              <w:bottom w:w="85" w:type="dxa"/>
-              <w:right w:w="85" w:type="dxa"/>
-            </w:tcMar>
-          </w:tcPr>
-          <w:p>
-            <w:pPr>
-              <w:spacing w:after="0" w:line="247" w:lineRule="auto"/>
-            </w:pPr>
-            <w:r>
-              <w:rPr>
-                <w:sz w:val="21"/>
-              </w:rPr>
-              <w:t>Ты</w:t>
-            </w:r>
-          </w:p>
-        </w:tc>
-        <w:tc>
-          <w:tcPr>
-            <w:tcW w:type="dxa" w:w="4838"/>
-            <w:vAlign w:val="center"/>
-            <w:shd w:fill="F2F5F7"/>
-            <w:tcMar>
-              <w:top w:w="85" w:type="dxa"/>
-              <w:left w:w="85" w:type="dxa"/>
-              <w:bottom w:w="85" w:type="dxa"/>
-              <w:right w:w="85" w:type="dxa"/>
-            </w:tcMar>
-          </w:tcPr>
-          <w:p>
-            <w:pPr>
-              <w:spacing w:after="0" w:line="247" w:lineRule="auto"/>
-            </w:pPr>
-            <w:r>
-              <w:rPr>
-                <w:sz w:val="21"/>
-              </w:rPr>
-              <w:t>Дизайнер оценивает понятность, художник — объём графики.</w:t>
-            </w:r>
-          </w:p>
-        </w:tc>
-      </w:tr>
-      <w:tr>
-        <w:trPr>
-          <w:cantSplit/>
-        </w:trPr>
-        <w:tc>
-          <w:tcPr>
-            <w:tcW w:type="dxa" w:w="3024"/>
-            <w:vAlign w:val="center"/>
-            <w:shd w:fill="FFFFFF"/>
-            <w:tcMar>
-              <w:top w:w="85" w:type="dxa"/>
-              <w:left w:w="85" w:type="dxa"/>
-              <w:bottom w:w="85" w:type="dxa"/>
-              <w:right w:w="85" w:type="dxa"/>
-            </w:tcMar>
-          </w:tcPr>
-          <w:p>
-            <w:pPr>
-              <w:spacing w:after="0" w:line="247" w:lineRule="auto"/>
-            </w:pPr>
-            <w:r>
-              <w:rPr>
-                <w:sz w:val="21"/>
-              </w:rPr>
-              <w:t>Код и сборка в Godot</w:t>
-            </w:r>
-          </w:p>
-        </w:tc>
-        <w:tc>
-          <w:tcPr>
-            <w:tcW w:type="dxa" w:w="2304"/>
-            <w:vAlign w:val="center"/>
-            <w:shd w:fill="FFFFFF"/>
-            <w:tcMar>
-              <w:top w:w="85" w:type="dxa"/>
-              <w:left w:w="85" w:type="dxa"/>
-              <w:bottom w:w="85" w:type="dxa"/>
-              <w:right w:w="85" w:type="dxa"/>
-            </w:tcMar>
-          </w:tcPr>
-          <w:p>
-            <w:pPr>
-              <w:spacing w:after="0" w:line="247" w:lineRule="auto"/>
-            </w:pPr>
-            <w:r>
-              <w:rPr>
-                <w:sz w:val="21"/>
-              </w:rPr>
-              <w:t>Ты</w:t>
-            </w:r>
-          </w:p>
-        </w:tc>
-        <w:tc>
-          <w:tcPr>
-            <w:tcW w:type="dxa" w:w="4838"/>
-            <w:vAlign w:val="center"/>
-            <w:shd w:fill="FFFFFF"/>
-            <w:tcMar>
-              <w:top w:w="85" w:type="dxa"/>
-              <w:left w:w="85" w:type="dxa"/>
-              <w:bottom w:w="85" w:type="dxa"/>
-              <w:right w:w="85" w:type="dxa"/>
-            </w:tcMar>
-          </w:tcPr>
-          <w:p>
-            <w:pPr>
-              <w:spacing w:after="0" w:line="247" w:lineRule="auto"/>
-            </w:pPr>
-            <w:r>
-              <w:rPr>
-                <w:sz w:val="21"/>
-              </w:rPr>
-              <w:t>Оба специалиста принимают отображение своей работы в игре.</w:t>
-            </w:r>
-          </w:p>
-        </w:tc>
-      </w:tr>
-      <w:tr>
-        <w:trPr>
-          <w:cantSplit/>
-        </w:trPr>
-        <w:tc>
-          <w:tcPr>
-            <w:tcW w:type="dxa" w:w="3024"/>
-            <w:vAlign w:val="center"/>
-            <w:shd w:fill="F2F5F7"/>
-            <w:tcMar>
-              <w:top w:w="85" w:type="dxa"/>
-              <w:left w:w="85" w:type="dxa"/>
-              <w:bottom w:w="85" w:type="dxa"/>
-              <w:right w:w="85" w:type="dxa"/>
-            </w:tcMar>
-          </w:tcPr>
-          <w:p>
-            <w:pPr>
-              <w:spacing w:after="0" w:line="247" w:lineRule="auto"/>
-            </w:pPr>
-            <w:r>
-              <w:rPr>
-                <w:sz w:val="21"/>
-              </w:rPr>
-              <w:t>Статьи и баланс</w:t>
-            </w:r>
-          </w:p>
-        </w:tc>
-        <w:tc>
-          <w:tcPr>
-            <w:tcW w:type="dxa" w:w="2304"/>
-            <w:vAlign w:val="center"/>
-            <w:shd w:fill="F2F5F7"/>
-            <w:tcMar>
-              <w:top w:w="85" w:type="dxa"/>
-              <w:left w:w="85" w:type="dxa"/>
-              <w:bottom w:w="85" w:type="dxa"/>
-              <w:right w:w="85" w:type="dxa"/>
-            </w:tcMar>
-          </w:tcPr>
-          <w:p>
-            <w:pPr>
-              <w:spacing w:after="0" w:line="247" w:lineRule="auto"/>
-            </w:pPr>
-            <w:r>
-              <w:rPr>
-                <w:sz w:val="21"/>
-              </w:rPr>
-              <w:t>Ты</w:t>
-            </w:r>
-          </w:p>
-        </w:tc>
-        <w:tc>
-          <w:tcPr>
-            <w:tcW w:type="dxa" w:w="4838"/>
-            <w:vAlign w:val="center"/>
-            <w:shd w:fill="F2F5F7"/>
-            <w:tcMar>
-              <w:top w:w="85" w:type="dxa"/>
-              <w:left w:w="85" w:type="dxa"/>
-              <w:bottom w:w="85" w:type="dxa"/>
-              <w:right w:w="85" w:type="dxa"/>
-            </w:tcMar>
-          </w:tcPr>
-          <w:p>
-            <w:pPr>
-              <w:spacing w:after="0" w:line="247" w:lineRule="auto"/>
-            </w:pPr>
-            <w:r>
-              <w:rPr>
-                <w:sz w:val="21"/>
-              </w:rPr>
-              <w:t>UX/UI дизайнер помогает с читаемостью и обратной связью.</w:t>
-            </w:r>
-          </w:p>
-        </w:tc>
-      </w:tr>
-      <w:tr>
-        <w:trPr>
-          <w:cantSplit/>
-        </w:trPr>
-        <w:tc>
-          <w:tcPr>
-            <w:tcW w:type="dxa" w:w="3024"/>
-            <w:vAlign w:val="center"/>
-            <w:shd w:fill="FFFFFF"/>
-            <w:tcMar>
-              <w:top w:w="85" w:type="dxa"/>
-              <w:left w:w="85" w:type="dxa"/>
-              <w:bottom w:w="85" w:type="dxa"/>
-              <w:right w:w="85" w:type="dxa"/>
-            </w:tcMar>
-          </w:tcPr>
-          <w:p>
-            <w:pPr>
-              <w:spacing w:after="0" w:line="247" w:lineRule="auto"/>
-            </w:pPr>
-            <w:r>
-              <w:rPr>
-                <w:sz w:val="21"/>
-              </w:rPr>
-              <w:t>Пользовательские сценарии</w:t>
-            </w:r>
-          </w:p>
-        </w:tc>
-        <w:tc>
-          <w:tcPr>
-            <w:tcW w:type="dxa" w:w="2304"/>
-            <w:vAlign w:val="center"/>
-            <w:shd w:fill="FFFFFF"/>
-            <w:tcMar>
-              <w:top w:w="85" w:type="dxa"/>
-              <w:left w:w="85" w:type="dxa"/>
-              <w:bottom w:w="85" w:type="dxa"/>
-              <w:right w:w="85" w:type="dxa"/>
-            </w:tcMar>
-          </w:tcPr>
-          <w:p>
-            <w:pPr>
-              <w:spacing w:after="0" w:line="247" w:lineRule="auto"/>
-            </w:pPr>
-            <w:r>
-              <w:rPr>
-                <w:sz w:val="21"/>
-              </w:rPr>
-              <w:t>UX/UI дизайнер</w:t>
-            </w:r>
-          </w:p>
-        </w:tc>
-        <w:tc>
-          <w:tcPr>
-            <w:tcW w:type="dxa" w:w="4838"/>
-            <w:vAlign w:val="center"/>
-            <w:shd w:fill="FFFFFF"/>
-            <w:tcMar>
-              <w:top w:w="85" w:type="dxa"/>
-              <w:left w:w="85" w:type="dxa"/>
-              <w:bottom w:w="85" w:type="dxa"/>
-              <w:right w:w="85" w:type="dxa"/>
-            </w:tcMar>
-          </w:tcPr>
-          <w:p>
-            <w:pPr>
-              <w:spacing w:after="0" w:line="247" w:lineRule="auto"/>
-            </w:pPr>
-            <w:r>
-              <w:rPr>
-                <w:sz w:val="21"/>
-              </w:rPr>
-              <w:t>Ты подтверждаешь поведение и реализуемость.</w:t>
-            </w:r>
-          </w:p>
-        </w:tc>
-      </w:tr>
-      <w:tr>
-        <w:trPr>
-          <w:cantSplit/>
-        </w:trPr>
-        <w:tc>
-          <w:tcPr>
-            <w:tcW w:type="dxa" w:w="3024"/>
-            <w:vAlign w:val="center"/>
-            <w:shd w:fill="F2F5F7"/>
-            <w:tcMar>
-              <w:top w:w="85" w:type="dxa"/>
-              <w:left w:w="85" w:type="dxa"/>
-              <w:bottom w:w="85" w:type="dxa"/>
-              <w:right w:w="85" w:type="dxa"/>
-            </w:tcMar>
-          </w:tcPr>
-          <w:p>
-            <w:pPr>
-              <w:spacing w:after="0" w:line="247" w:lineRule="auto"/>
-            </w:pPr>
-            <w:r>
-              <w:rPr>
-                <w:sz w:val="21"/>
-              </w:rPr>
-              <w:t>Компоненты и состояния UI</w:t>
-            </w:r>
-          </w:p>
-        </w:tc>
-        <w:tc>
-          <w:tcPr>
-            <w:tcW w:type="dxa" w:w="2304"/>
-            <w:vAlign w:val="center"/>
-            <w:shd w:fill="F2F5F7"/>
-            <w:tcMar>
-              <w:top w:w="85" w:type="dxa"/>
-              <w:left w:w="85" w:type="dxa"/>
-              <w:bottom w:w="85" w:type="dxa"/>
-              <w:right w:w="85" w:type="dxa"/>
-            </w:tcMar>
-          </w:tcPr>
-          <w:p>
-            <w:pPr>
-              <w:spacing w:after="0" w:line="247" w:lineRule="auto"/>
-            </w:pPr>
-            <w:r>
-              <w:rPr>
-                <w:sz w:val="21"/>
-              </w:rPr>
-              <w:t>UX/UI дизайнер</w:t>
-            </w:r>
-          </w:p>
-        </w:tc>
-        <w:tc>
-          <w:tcPr>
-            <w:tcW w:type="dxa" w:w="4838"/>
-            <w:vAlign w:val="center"/>
-            <w:shd w:fill="F2F5F7"/>
-            <w:tcMar>
-              <w:top w:w="85" w:type="dxa"/>
-              <w:left w:w="85" w:type="dxa"/>
-              <w:bottom w:w="85" w:type="dxa"/>
-              <w:right w:w="85" w:type="dxa"/>
-            </w:tcMar>
-          </w:tcPr>
-          <w:p>
-            <w:pPr>
-              <w:spacing w:after="0" w:line="247" w:lineRule="auto"/>
-            </w:pPr>
-            <w:r>
-              <w:rPr>
-                <w:sz w:val="21"/>
-              </w:rPr>
-              <w:t>Художник согласует оформление, ты интегрируешь.</w:t>
-            </w:r>
-          </w:p>
-        </w:tc>
-      </w:tr>
-      <w:tr>
-        <w:trPr>
-          <w:cantSplit/>
-        </w:trPr>
-        <w:tc>
-          <w:tcPr>
-            <w:tcW w:type="dxa" w:w="3024"/>
-            <w:vAlign w:val="center"/>
-            <w:shd w:fill="FFFFFF"/>
-            <w:tcMar>
-              <w:top w:w="85" w:type="dxa"/>
-              <w:left w:w="85" w:type="dxa"/>
-              <w:bottom w:w="85" w:type="dxa"/>
-              <w:right w:w="85" w:type="dxa"/>
-            </w:tcMar>
-          </w:tcPr>
-          <w:p>
-            <w:pPr>
-              <w:spacing w:after="0" w:line="247" w:lineRule="auto"/>
-            </w:pPr>
-            <w:r>
-              <w:rPr>
-                <w:sz w:val="21"/>
-              </w:rPr>
-              <w:t>Фоны предметы персонажи</w:t>
-            </w:r>
-          </w:p>
-        </w:tc>
-        <w:tc>
-          <w:tcPr>
-            <w:tcW w:type="dxa" w:w="2304"/>
-            <w:vAlign w:val="center"/>
-            <w:shd w:fill="FFFFFF"/>
-            <w:tcMar>
-              <w:top w:w="85" w:type="dxa"/>
-              <w:left w:w="85" w:type="dxa"/>
-              <w:bottom w:w="85" w:type="dxa"/>
-              <w:right w:w="85" w:type="dxa"/>
-            </w:tcMar>
-          </w:tcPr>
-          <w:p>
-            <w:pPr>
-              <w:spacing w:after="0" w:line="247" w:lineRule="auto"/>
-            </w:pPr>
-            <w:r>
-              <w:rPr>
-                <w:sz w:val="21"/>
-              </w:rPr>
-              <w:t>Художник</w:t>
-            </w:r>
-          </w:p>
-        </w:tc>
-        <w:tc>
-          <w:tcPr>
-            <w:tcW w:type="dxa" w:w="4838"/>
-            <w:vAlign w:val="center"/>
-            <w:shd w:fill="FFFFFF"/>
-            <w:tcMar>
-              <w:top w:w="85" w:type="dxa"/>
-              <w:left w:w="85" w:type="dxa"/>
-              <w:bottom w:w="85" w:type="dxa"/>
-              <w:right w:w="85" w:type="dxa"/>
-            </w:tcMar>
-          </w:tcPr>
-          <w:p>
-            <w:pPr>
-              <w:spacing w:after="0" w:line="247" w:lineRule="auto"/>
-            </w:pPr>
-            <w:r>
-              <w:rPr>
-                <w:sz w:val="21"/>
-              </w:rPr>
-              <w:t>UX задаёт размеры и зоны; ты связываешь графику с игрой.</w:t>
-            </w:r>
-          </w:p>
-        </w:tc>
-      </w:tr>
-      <w:tr>
-        <w:trPr>
-          <w:cantSplit/>
-        </w:trPr>
-        <w:tc>
-          <w:tcPr>
-            <w:tcW w:type="dxa" w:w="3024"/>
-            <w:vAlign w:val="center"/>
-            <w:shd w:fill="F2F5F7"/>
-            <w:tcMar>
-              <w:top w:w="85" w:type="dxa"/>
-              <w:left w:w="85" w:type="dxa"/>
-              <w:bottom w:w="85" w:type="dxa"/>
-              <w:right w:w="85" w:type="dxa"/>
-            </w:tcMar>
-          </w:tcPr>
-          <w:p>
-            <w:pPr>
-              <w:spacing w:after="0" w:line="247" w:lineRule="auto"/>
-            </w:pPr>
-            <w:r>
-              <w:rPr>
-                <w:sz w:val="21"/>
-              </w:rPr>
-              <w:t>Анимации</w:t>
-            </w:r>
-          </w:p>
-        </w:tc>
-        <w:tc>
-          <w:tcPr>
-            <w:tcW w:type="dxa" w:w="2304"/>
-            <w:vAlign w:val="center"/>
-            <w:shd w:fill="F2F5F7"/>
-            <w:tcMar>
-              <w:top w:w="85" w:type="dxa"/>
-              <w:left w:w="85" w:type="dxa"/>
-              <w:bottom w:w="85" w:type="dxa"/>
-              <w:right w:w="85" w:type="dxa"/>
-            </w:tcMar>
-          </w:tcPr>
-          <w:p>
-            <w:pPr>
-              <w:spacing w:after="0" w:line="247" w:lineRule="auto"/>
-            </w:pPr>
-            <w:r>
-              <w:rPr>
-                <w:sz w:val="21"/>
-              </w:rPr>
-              <w:t>Художник — кадры</w:t>
-            </w:r>
-          </w:p>
-        </w:tc>
-        <w:tc>
-          <w:tcPr>
-            <w:tcW w:type="dxa" w:w="4838"/>
-            <w:vAlign w:val="center"/>
-            <w:shd w:fill="F2F5F7"/>
-            <w:tcMar>
-              <w:top w:w="85" w:type="dxa"/>
-              <w:left w:w="85" w:type="dxa"/>
-              <w:bottom w:w="85" w:type="dxa"/>
-              <w:right w:w="85" w:type="dxa"/>
-            </w:tcMar>
-          </w:tcPr>
-          <w:p>
-            <w:pPr>
-              <w:spacing w:after="0" w:line="247" w:lineRule="auto"/>
-            </w:pPr>
-            <w:r>
-              <w:rPr>
-                <w:sz w:val="21"/>
-              </w:rPr>
-              <w:t>Ты — запуск; дизайнер — своевременность отклика.</w:t>
-            </w:r>
-          </w:p>
-        </w:tc>
-      </w:tr>
-      <w:tr>
-        <w:trPr>
-          <w:cantSplit/>
-        </w:trPr>
-        <w:tc>
-          <w:tcPr>
-            <w:tcW w:type="dxa" w:w="3024"/>
-            <w:vAlign w:val="center"/>
-            <w:shd w:fill="FFFFFF"/>
-            <w:tcMar>
-              <w:top w:w="85" w:type="dxa"/>
-              <w:left w:w="85" w:type="dxa"/>
-              <w:bottom w:w="85" w:type="dxa"/>
-              <w:right w:w="85" w:type="dxa"/>
-            </w:tcMar>
-          </w:tcPr>
-          <w:p>
-            <w:pPr>
-              <w:spacing w:after="0" w:line="247" w:lineRule="auto"/>
-            </w:pPr>
-            <w:r>
-              <w:rPr>
-                <w:sz w:val="21"/>
-              </w:rPr>
-              <w:t>Тест удобства</w:t>
-            </w:r>
-          </w:p>
-        </w:tc>
-        <w:tc>
-          <w:tcPr>
-            <w:tcW w:type="dxa" w:w="2304"/>
-            <w:vAlign w:val="center"/>
-            <w:shd w:fill="FFFFFF"/>
-            <w:tcMar>
-              <w:top w:w="85" w:type="dxa"/>
-              <w:left w:w="85" w:type="dxa"/>
-              <w:bottom w:w="85" w:type="dxa"/>
-              <w:right w:w="85" w:type="dxa"/>
-            </w:tcMar>
-          </w:tcPr>
-          <w:p>
-            <w:pPr>
-              <w:spacing w:after="0" w:line="247" w:lineRule="auto"/>
-            </w:pPr>
-            <w:r>
-              <w:rPr>
-                <w:sz w:val="21"/>
-              </w:rPr>
-              <w:t>UX/UI дизайнер</w:t>
-            </w:r>
-          </w:p>
-        </w:tc>
-        <w:tc>
-          <w:tcPr>
-            <w:tcW w:type="dxa" w:w="4838"/>
-            <w:vAlign w:val="center"/>
-            <w:shd w:fill="FFFFFF"/>
-            <w:tcMar>
-              <w:top w:w="85" w:type="dxa"/>
-              <w:left w:w="85" w:type="dxa"/>
-              <w:bottom w:w="85" w:type="dxa"/>
-              <w:right w:w="85" w:type="dxa"/>
-            </w:tcMar>
-          </w:tcPr>
-          <w:p>
-            <w:pPr>
-              <w:spacing w:after="0" w:line="247" w:lineRule="auto"/>
-            </w:pPr>
-            <w:r>
-              <w:rPr>
-                <w:sz w:val="21"/>
-              </w:rPr>
-              <w:t>Ты фиксируешь проблемы, все исправляют своё направление.</w:t>
-            </w:r>
-          </w:p>
-        </w:tc>
-      </w:tr>
-      <w:tr>
-        <w:trPr>
-          <w:cantSplit/>
-        </w:trPr>
-        <w:tc>
-          <w:tcPr>
-            <w:tcW w:type="dxa" w:w="3024"/>
-            <w:vAlign w:val="center"/>
-            <w:shd w:fill="F2F5F7"/>
-            <w:tcMar>
-              <w:top w:w="85" w:type="dxa"/>
-              <w:left w:w="85" w:type="dxa"/>
-              <w:bottom w:w="85" w:type="dxa"/>
-              <w:right w:w="85" w:type="dxa"/>
-            </w:tcMar>
-          </w:tcPr>
-          <w:p>
-            <w:pPr>
-              <w:spacing w:after="0" w:line="247" w:lineRule="auto"/>
-            </w:pPr>
-            <w:r>
-              <w:rPr>
-                <w:sz w:val="21"/>
-              </w:rPr>
-              <w:t>Готовность проекта к сдаче</w:t>
-            </w:r>
-          </w:p>
-        </w:tc>
-        <w:tc>
-          <w:tcPr>
-            <w:tcW w:type="dxa" w:w="2304"/>
-            <w:vAlign w:val="center"/>
-            <w:shd w:fill="F2F5F7"/>
-            <w:tcMar>
-              <w:top w:w="85" w:type="dxa"/>
-              <w:left w:w="85" w:type="dxa"/>
-              <w:bottom w:w="85" w:type="dxa"/>
-              <w:right w:w="85" w:type="dxa"/>
-            </w:tcMar>
-          </w:tcPr>
-          <w:p>
-            <w:pPr>
-              <w:spacing w:after="0" w:line="247" w:lineRule="auto"/>
-            </w:pPr>
-            <w:r>
-              <w:rPr>
-                <w:sz w:val="21"/>
-              </w:rPr>
-              <w:t>Ты</w:t>
-            </w:r>
-          </w:p>
-        </w:tc>
-        <w:tc>
-          <w:tcPr>
-            <w:tcW w:type="dxa" w:w="4838"/>
-            <w:vAlign w:val="center"/>
-            <w:shd w:fill="F2F5F7"/>
-            <w:tcMar>
-              <w:top w:w="85" w:type="dxa"/>
-              <w:left w:w="85" w:type="dxa"/>
-              <w:bottom w:w="85" w:type="dxa"/>
-              <w:right w:w="85" w:type="dxa"/>
-            </w:tcMar>
-          </w:tcPr>
-          <w:p>
-            <w:pPr>
-              <w:spacing w:after="0" w:line="247" w:lineRule="auto"/>
-            </w:pPr>
-            <w:r>
-              <w:rPr>
-                <w:sz w:val="21"/>
-              </w:rPr>
-              <w:t>Вся команда проходит итоговый игровой маршрут.</w:t>
-            </w:r>
-          </w:p>
-        </w:tc>
-      </w:tr>
-    </w:tbl>
-    <w:p>
-      <w:pPr>
-        <w:spacing w:after="0"/>
-      </w:pPr>
-    </w:p>
-    <w:p>
-      <w:pPr>
-        <w:pStyle w:val="Heading2"/>
-      </w:pPr>
-      <w:r>
-        <w:t>Как идёт работа</w:t>
-      </w:r>
-    </w:p>
-    <w:p>
-      <w:r>
-        <w:t>UX/UI дизайнер делает схему экрана и действий. Ты подтверждаешь механику. Художник готовит графику по согласованным размерам. Ты собираешь экран в Godot. После этого дизайнер и художник смотрят результат в игре и дают правки.</w:t>
-      </w:r>
-    </w:p>
-    <w:p>
-      <w:r>
-        <w:t>Макеты не вводят новую механику без обсуждения. Художник не объединяет кликабельные объекты в неделимый фон. Разработчик не меняет согласованный пользовательский сценарий без предупреждения.</w:t>
-      </w:r>
-    </w:p>
-    <w:p>
-      <w:pPr>
-        <w:pStyle w:val="Heading2"/>
-      </w:pPr>
-      <w:r>
-        <w:t>Границы решений</w:t>
-      </w:r>
-    </w:p>
-    <w:p>
-      <w:r>
-        <w:t>Ты принимаешь окончательные решения по правилам, балансу и объёму. UX/UI дизайнер определяет навигацию, иерархию информации и состояния в этих рамках. Художник отвечает за стиль и изображение в принятой компоновке.</w:t>
-      </w:r>
-    </w:p>
-    <w:p>
-      <w:r>
-        <w:t>Детальные задачи вы расписываете самостоятельно. Для каждой достаточно указать владельца, ожидаемый результат и то, что нужно получить от другого участника. Отправленный файл считается завершённой работой после интеграции и принятия в игре.</w:t>
-      </w:r>
-    </w:p>
-    <w:p>
-      <w:r>
-        <w:br w:type="page"/>
-      </w:r>
-    </w:p>
-    <w:p>
-      <w:pPr>
-        <w:pStyle w:val="Heading1"/>
-      </w:pPr>
-      <w:r>
-        <w:t>8 План доведения прототипа</w:t>
-      </w:r>
-    </w:p>
-    <w:p>
-      <w:r>
-        <w:t>Этапы ниже — ориентир для оставшейся работы. Если команда располагает тремя неделями, каждому можно отвести примерно неделю; фактические сроки вы назначаете самостоятельно.</w:t>
-      </w:r>
-    </w:p>
-    <w:tbl>
-      <w:tblPr>
-        <w:tblW w:type="auto" w:w="0"/>
-        <w:jc w:val="center"/>
-        <w:tblLayout w:type="fixed"/>
-        <w:tblLook w:firstColumn="1" w:firstRow="1" w:lastColumn="0" w:lastRow="0" w:noHBand="0" w:noVBand="1" w:val="04A0"/>
-        <w:tblBorders>
-          <w:top w:val="single" w:sz="4" w:color="D9D9D9"/>
-          <w:left w:val="single" w:sz="4" w:color="D9D9D9"/>
-          <w:bottom w:val="single" w:sz="4" w:color="D9D9D9"/>
-          <w:right w:val="single" w:sz="4" w:color="D9D9D9"/>
-          <w:insideH w:val="single" w:sz="4" w:color="D9D9D9"/>
-          <w:insideV w:val="single" w:sz="4" w:color="D9D9D9"/>
-        </w:tblBorders>
-      </w:tblPr>
-      <w:tblGrid>
-        <w:gridCol w:w="1728"/>
-        <w:gridCol w:w="2822"/>
-        <w:gridCol w:w="2808"/>
-        <w:gridCol w:w="2808"/>
-      </w:tblGrid>
-      <w:tr>
-        <w:trPr>
-          <w:cantSplit/>
-          <w:tblHeader/>
-        </w:trPr>
-        <w:tc>
-          <w:tcPr>
-            <w:tcW w:type="dxa" w:w="1728"/>
-            <w:vAlign w:val="center"/>
-            <w:shd w:fill="243B48"/>
-            <w:tcMar>
-              <w:top w:w="85" w:type="dxa"/>
-              <w:left w:w="85" w:type="dxa"/>
-              <w:bottom w:w="85" w:type="dxa"/>
-              <w:right w:w="85" w:type="dxa"/>
-            </w:tcMar>
-          </w:tcPr>
-          <w:p>
-            <w:pPr>
-              <w:spacing w:after="0" w:line="247" w:lineRule="auto"/>
-            </w:pPr>
-            <w:r>
-              <w:rPr>
-                <w:b/>
-                <w:color w:val="FFFFFF"/>
-                <w:sz w:val="21"/>
-              </w:rPr>
-              <w:t>Этап</w:t>
-            </w:r>
-          </w:p>
-        </w:tc>
-        <w:tc>
-          <w:tcPr>
-            <w:tcW w:type="dxa" w:w="2822"/>
-            <w:vAlign w:val="center"/>
-            <w:shd w:fill="243B48"/>
-            <w:tcMar>
-              <w:top w:w="85" w:type="dxa"/>
-              <w:left w:w="85" w:type="dxa"/>
-              <w:bottom w:w="85" w:type="dxa"/>
-              <w:right w:w="85" w:type="dxa"/>
-            </w:tcMar>
-          </w:tcPr>
-          <w:p>
-            <w:pPr>
-              <w:spacing w:after="0" w:line="247" w:lineRule="auto"/>
-            </w:pPr>
-            <w:r>
-              <w:rPr>
-                <w:b/>
-                <w:color w:val="FFFFFF"/>
-                <w:sz w:val="21"/>
-              </w:rPr>
-              <w:t>Разработка</w:t>
-            </w:r>
-          </w:p>
-        </w:tc>
-        <w:tc>
-          <w:tcPr>
-            <w:tcW w:type="dxa" w:w="2808"/>
-            <w:vAlign w:val="center"/>
-            <w:shd w:fill="243B48"/>
-            <w:tcMar>
-              <w:top w:w="85" w:type="dxa"/>
-              <w:left w:w="85" w:type="dxa"/>
-              <w:bottom w:w="85" w:type="dxa"/>
-              <w:right w:w="85" w:type="dxa"/>
-            </w:tcMar>
-          </w:tcPr>
-          <w:p>
-            <w:pPr>
-              <w:spacing w:after="0" w:line="247" w:lineRule="auto"/>
-            </w:pPr>
-            <w:r>
-              <w:rPr>
-                <w:b/>
-                <w:color w:val="FFFFFF"/>
-                <w:sz w:val="21"/>
-              </w:rPr>
-              <w:t>Графика</w:t>
-            </w:r>
-          </w:p>
-        </w:tc>
-        <w:tc>
-          <w:tcPr>
-            <w:tcW w:type="dxa" w:w="2808"/>
-            <w:vAlign w:val="center"/>
-            <w:shd w:fill="243B48"/>
-            <w:tcMar>
-              <w:top w:w="85" w:type="dxa"/>
-              <w:left w:w="85" w:type="dxa"/>
-              <w:bottom w:w="85" w:type="dxa"/>
-              <w:right w:w="85" w:type="dxa"/>
-            </w:tcMar>
-          </w:tcPr>
-          <w:p>
-            <w:pPr>
-              <w:spacing w:after="0" w:line="247" w:lineRule="auto"/>
-            </w:pPr>
-            <w:r>
-              <w:rPr>
-                <w:b/>
-                <w:color w:val="FFFFFF"/>
-                <w:sz w:val="21"/>
-              </w:rPr>
-              <w:t>UX и UI</w:t>
-            </w:r>
-          </w:p>
-        </w:tc>
-      </w:tr>
-      <w:tr>
-        <w:trPr>
-          <w:cantSplit/>
-        </w:trPr>
-        <w:tc>
-          <w:tcPr>
-            <w:tcW w:type="dxa" w:w="1728"/>
-            <w:vAlign w:val="center"/>
-            <w:shd w:fill="F2F5F7"/>
-            <w:tcMar>
-              <w:top w:w="85" w:type="dxa"/>
-              <w:left w:w="85" w:type="dxa"/>
-              <w:bottom w:w="85" w:type="dxa"/>
-              <w:right w:w="85" w:type="dxa"/>
-            </w:tcMar>
-          </w:tcPr>
-          <w:p>
-            <w:pPr>
-              <w:spacing w:after="0" w:line="247" w:lineRule="auto"/>
-            </w:pPr>
-            <w:r>
-              <w:rPr>
-                <w:sz w:val="21"/>
-              </w:rPr>
-              <w:t>Определить вид игры</w:t>
-            </w:r>
-          </w:p>
-        </w:tc>
-        <w:tc>
-          <w:tcPr>
-            <w:tcW w:type="dxa" w:w="2822"/>
-            <w:vAlign w:val="center"/>
-            <w:shd w:fill="F2F5F7"/>
-            <w:tcMar>
-              <w:top w:w="85" w:type="dxa"/>
-              <w:left w:w="85" w:type="dxa"/>
-              <w:bottom w:w="85" w:type="dxa"/>
-              <w:right w:w="85" w:type="dxa"/>
-            </w:tcMar>
-          </w:tcPr>
-          <w:p>
-            <w:pPr>
-              <w:spacing w:after="0" w:line="247" w:lineRule="auto"/>
-            </w:pPr>
-            <w:r>
-              <w:rPr>
-                <w:sz w:val="21"/>
-              </w:rPr>
-              <w:t>Зафиксировать правила; привести контент к единому тону; оценить баланс.</w:t>
-            </w:r>
-          </w:p>
-        </w:tc>
-        <w:tc>
-          <w:tcPr>
-            <w:tcW w:type="dxa" w:w="2808"/>
-            <w:vAlign w:val="center"/>
-            <w:shd w:fill="F2F5F7"/>
-            <w:tcMar>
-              <w:top w:w="85" w:type="dxa"/>
-              <w:left w:w="85" w:type="dxa"/>
-              <w:bottom w:w="85" w:type="dxa"/>
-              <w:right w:w="85" w:type="dxa"/>
-            </w:tcMar>
-          </w:tcPr>
-          <w:p>
-            <w:pPr>
-              <w:spacing w:after="0" w:line="247" w:lineRule="auto"/>
-            </w:pPr>
-            <w:r>
-              <w:rPr>
-                <w:sz w:val="21"/>
-              </w:rPr>
-              <w:t>Согласовать образцы двух локаций и героини.</w:t>
-            </w:r>
-          </w:p>
-        </w:tc>
-        <w:tc>
-          <w:tcPr>
-            <w:tcW w:type="dxa" w:w="2808"/>
-            <w:vAlign w:val="center"/>
-            <w:shd w:fill="F2F5F7"/>
-            <w:tcMar>
-              <w:top w:w="85" w:type="dxa"/>
-              <w:left w:w="85" w:type="dxa"/>
-              <w:bottom w:w="85" w:type="dxa"/>
-              <w:right w:w="85" w:type="dxa"/>
-            </w:tcMar>
-          </w:tcPr>
-          <w:p>
-            <w:pPr>
-              <w:spacing w:after="0" w:line="247" w:lineRule="auto"/>
-            </w:pPr>
-            <w:r>
-              <w:rPr>
-                <w:sz w:val="21"/>
-              </w:rPr>
-              <w:t>Собрать маршруты и макеты основных экранов.</w:t>
-            </w:r>
-          </w:p>
-        </w:tc>
-      </w:tr>
-      <w:tr>
-        <w:trPr>
-          <w:cantSplit/>
-        </w:trPr>
-        <w:tc>
-          <w:tcPr>
-            <w:tcW w:type="dxa" w:w="1728"/>
-            <w:vAlign w:val="center"/>
-            <w:shd w:fill="FFFFFF"/>
-            <w:tcMar>
-              <w:top w:w="85" w:type="dxa"/>
-              <w:left w:w="85" w:type="dxa"/>
-              <w:bottom w:w="85" w:type="dxa"/>
-              <w:right w:w="85" w:type="dxa"/>
-            </w:tcMar>
-          </w:tcPr>
-          <w:p>
-            <w:pPr>
-              <w:spacing w:after="0" w:line="247" w:lineRule="auto"/>
-            </w:pPr>
-            <w:r>
-              <w:rPr>
-                <w:sz w:val="21"/>
-              </w:rPr>
-              <w:t>Собрать цельный цикл</w:t>
-            </w:r>
-          </w:p>
-        </w:tc>
-        <w:tc>
-          <w:tcPr>
-            <w:tcW w:type="dxa" w:w="2822"/>
-            <w:vAlign w:val="center"/>
-            <w:shd w:fill="FFFFFF"/>
-            <w:tcMar>
-              <w:top w:w="85" w:type="dxa"/>
-              <w:left w:w="85" w:type="dxa"/>
-              <w:bottom w:w="85" w:type="dxa"/>
-              <w:right w:w="85" w:type="dxa"/>
-            </w:tcMar>
-          </w:tcPr>
-          <w:p>
-            <w:pPr>
-              <w:spacing w:after="0" w:line="247" w:lineRule="auto"/>
-            </w:pPr>
-            <w:r>
-              <w:rPr>
-                <w:sz w:val="21"/>
-              </w:rPr>
-              <w:t>Интегрировать интерфейс и предметы; связать состояния.</w:t>
-            </w:r>
-          </w:p>
-        </w:tc>
-        <w:tc>
-          <w:tcPr>
-            <w:tcW w:type="dxa" w:w="2808"/>
-            <w:vAlign w:val="center"/>
-            <w:shd w:fill="FFFFFF"/>
-            <w:tcMar>
-              <w:top w:w="85" w:type="dxa"/>
-              <w:left w:w="85" w:type="dxa"/>
-              <w:bottom w:w="85" w:type="dxa"/>
-              <w:right w:w="85" w:type="dxa"/>
-            </w:tcMar>
-          </w:tcPr>
-          <w:p>
-            <w:pPr>
-              <w:spacing w:after="0" w:line="247" w:lineRule="auto"/>
-            </w:pPr>
-            <w:r>
-              <w:rPr>
-                <w:sz w:val="21"/>
-              </w:rPr>
-              <w:t>Подготовить основные фоны, предметы и персонажей.</w:t>
-            </w:r>
-          </w:p>
-        </w:tc>
-        <w:tc>
-          <w:tcPr>
-            <w:tcW w:type="dxa" w:w="2808"/>
-            <w:vAlign w:val="center"/>
-            <w:shd w:fill="FFFFFF"/>
-            <w:tcMar>
-              <w:top w:w="85" w:type="dxa"/>
-              <w:left w:w="85" w:type="dxa"/>
-              <w:bottom w:w="85" w:type="dxa"/>
-              <w:right w:w="85" w:type="dxa"/>
-            </w:tcMar>
-          </w:tcPr>
-          <w:p>
-            <w:pPr>
-              <w:spacing w:after="0" w:line="247" w:lineRule="auto"/>
-            </w:pPr>
-            <w:r>
-              <w:rPr>
-                <w:sz w:val="21"/>
-              </w:rPr>
-              <w:t>Подготовить компоненты, окна и недоступные состояния.</w:t>
-            </w:r>
-          </w:p>
-        </w:tc>
-      </w:tr>
-      <w:tr>
-        <w:trPr>
-          <w:cantSplit/>
-        </w:trPr>
-        <w:tc>
-          <w:tcPr>
-            <w:tcW w:type="dxa" w:w="1728"/>
-            <w:vAlign w:val="center"/>
-            <w:shd w:fill="F2F5F7"/>
-            <w:tcMar>
-              <w:top w:w="85" w:type="dxa"/>
-              <w:left w:w="85" w:type="dxa"/>
-              <w:bottom w:w="85" w:type="dxa"/>
-              <w:right w:w="85" w:type="dxa"/>
-            </w:tcMar>
-          </w:tcPr>
-          <w:p>
-            <w:pPr>
-              <w:spacing w:after="0" w:line="247" w:lineRule="auto"/>
-            </w:pPr>
-            <w:r>
-              <w:rPr>
-                <w:sz w:val="21"/>
-              </w:rPr>
-              <w:t>Довести до показа</w:t>
-            </w:r>
-          </w:p>
-        </w:tc>
-        <w:tc>
-          <w:tcPr>
-            <w:tcW w:type="dxa" w:w="2822"/>
-            <w:vAlign w:val="center"/>
-            <w:shd w:fill="F2F5F7"/>
-            <w:tcMar>
-              <w:top w:w="85" w:type="dxa"/>
-              <w:left w:w="85" w:type="dxa"/>
-              <w:bottom w:w="85" w:type="dxa"/>
-              <w:right w:w="85" w:type="dxa"/>
-            </w:tcMar>
-          </w:tcPr>
-          <w:p>
-            <w:pPr>
-              <w:spacing w:after="0" w:line="247" w:lineRule="auto"/>
-            </w:pPr>
-            <w:r>
-              <w:rPr>
-                <w:sz w:val="21"/>
-              </w:rPr>
-              <w:t>Исправить мешающие игре ошибки и скорректировать баланс.</w:t>
-            </w:r>
-          </w:p>
-        </w:tc>
-        <w:tc>
-          <w:tcPr>
-            <w:tcW w:type="dxa" w:w="2808"/>
-            <w:vAlign w:val="center"/>
-            <w:shd w:fill="F2F5F7"/>
-            <w:tcMar>
-              <w:top w:w="85" w:type="dxa"/>
-              <w:left w:w="85" w:type="dxa"/>
-              <w:bottom w:w="85" w:type="dxa"/>
-              <w:right w:w="85" w:type="dxa"/>
-            </w:tcMar>
-          </w:tcPr>
-          <w:p>
-            <w:pPr>
-              <w:spacing w:after="0" w:line="247" w:lineRule="auto"/>
-            </w:pPr>
-            <w:r>
-              <w:rPr>
-                <w:sz w:val="21"/>
-              </w:rPr>
-              <w:t>Устранить визуальные проблемы; затем добавить мелкие анимации.</w:t>
-            </w:r>
-          </w:p>
-        </w:tc>
-        <w:tc>
-          <w:tcPr>
-            <w:tcW w:type="dxa" w:w="2808"/>
-            <w:vAlign w:val="center"/>
-            <w:shd w:fill="F2F5F7"/>
-            <w:tcMar>
-              <w:top w:w="85" w:type="dxa"/>
-              <w:left w:w="85" w:type="dxa"/>
-              <w:bottom w:w="85" w:type="dxa"/>
-              <w:right w:w="85" w:type="dxa"/>
-            </w:tcMar>
-          </w:tcPr>
-          <w:p>
-            <w:pPr>
-              <w:spacing w:after="0" w:line="247" w:lineRule="auto"/>
-            </w:pPr>
-            <w:r>
-              <w:rPr>
-                <w:sz w:val="21"/>
-              </w:rPr>
-              <w:t>Проверить понятность действий и читаемость в готовой игре.</w:t>
-            </w:r>
-          </w:p>
-        </w:tc>
-      </w:tr>
-    </w:tbl>
-    <w:p>
-      <w:pPr>
-        <w:spacing w:after="0"/>
-      </w:pPr>
-    </w:p>
-    <w:p>
-      <w:pPr>
-        <w:pStyle w:val="Heading2"/>
-      </w:pPr>
-      <w:r>
-        <w:t>Приоритеты</w:t>
-      </w:r>
-    </w:p>
-    <w:p>
-      <w:r>
-        <w:t>Обязательно: понятный выбор заголовка, последствия, завершение выпуска, вечер, переход к следующему дню, четыре причины проигрыша и цельная графика двух локаций.</w:t>
-      </w:r>
-    </w:p>
-    <w:p>
-      <w:r>
-        <w:t>После основного: декоративные анимации, лёгкий звуковой отклик, настройка помех в игровом меню. Сохранения, большой новый контент и дополнительные системы остаются за пределами MVP.</w:t>
-      </w:r>
-    </w:p>
-    <w:p>
-      <w:pPr>
-        <w:pStyle w:val="Heading2"/>
-      </w:pPr>
-      <w:r>
-        <w:t>Что считать готовым прототипом</w:t>
-      </w:r>
-    </w:p>
-    <w:p>
-      <w:r>
-        <w:t>Новый игрок без помощи команды проходит один день от редакции до следующей смены, понимает смысл шкал и видит связь заголовка с последствиями. Интерфейс читается в Full HD. Ни одно основное действие не требует устного объяснения разработчика.</w:t>
-      </w:r>
-    </w:p>
-    <w:p>
-      <w:r>
-        <w:t>Для оценки направления достаточно дать нескольким новым игрокам пройти несколько смен и спросить: почему они выбрали заголовок, почему изменились показатели, зачем покупали кофе и что оказалось непонятным. Баланс корректируем по этим наблюдениям.</w:t>
-      </w:r>
-    </w:p>
-    <w:p>
-      <w:pPr>
-        <w:pStyle w:val="Heading2"/>
-      </w:pPr>
-      <w:r>
-        <w:t>Что согласовать перед дальнейшей работой</w:t>
-      </w:r>
-    </w:p>
-    <w:p>
-      <w:r>
-        <w:t>Длительность демонстрации: оставить текущий цикл до проигрыша или сделать отдельное завершение после нескольких дней. Тональность: степень сатиры и допустимая лексика. Визуальный эталон: образцы редакции и дома. Ответственность: подтвердить роли и дату сдачи.</w:t>
-      </w:r>
-    </w:p>
-    <w:p>
-      <w:r>
-        <w:t>Ближайший общий результат — один цельный цикл «редакция → дом → следующая смена» с понятным интерфейсом и согласованным визуальным стилем. После него команда уточняет подробный список задач.</w:t>
+        <w:t>Дизайнер — макет одного рабочего экрана и вечера. Художник — по одному образцу стола и комнаты. Ты — один полный день с понятными статьями. Затем объединяем, даём поиграть человеку со стороны и выбираем следующую проблему. Новые задачи берём по одной, а не весь список сразу.</w:t>
       </w:r>
     </w:p>
     <w:sectPr>
-      <w:footerReference w:type="default" r:id="rId9"/>
       <w:pgSz w:w="12240" w:h="15840"/>
-      <w:pgMar w:top="936" w:right="1037" w:bottom="936" w:left="1037" w:header="720" w:footer="720" w:gutter="0"/>
+      <w:pgMar w:top="792" w:right="936" w:bottom="792" w:left="936" w:header="720" w:footer="720" w:gutter="0"/>
       <w:cols w:space="720"/>
       <w:docGrid w:linePitch="360"/>
     </w:sectPr>
   </w:body>
 </w:document>
-</file>
-
-<file path=word/footer1.xml><?xml version="1.0" encoding="utf-8"?>
-<w:ftr xmlns:m="http://schemas.openxmlformats.org/officeDocument/2006/math" xmlns:mc="http://schemas.openxmlformats.org/markup-compatibility/2006" xmlns:mo="http://schemas.microsoft.com/office/mac/office/2008/main" xmlns:mv="urn:schemas-microsoft-com:mac:vml" xmlns:o="urn:schemas-microsoft-com:office:office" xmlns:r="http://schemas.openxmlformats.org/officeDocument/2006/relationships" xmlns:v="urn:schemas-microsoft-com:vml" xmlns:w10="urn:schemas-microsoft-com:office:word" xmlns:w14="http://schemas.microsoft.com/office/word/2010/wordml" xmlns:w="http://schemas.openxmlformats.org/wordprocessingml/2006/main" xmlns:wne="http://schemas.microsoft.com/office/word/2006/wordml" xmlns:wp14="http://schemas.microsoft.com/office/word/2010/wordprocessingDrawing" xmlns:wp="http://schemas.openxmlformats.org/drawingml/2006/wordprocessingDrawing" xmlns:wpc="http://schemas.microsoft.com/office/word/2010/wordprocessingCanvas" xmlns:wpg="http://schemas.microsoft.com/office/word/2010/wordprocessingGroup" xmlns:wpi="http://schemas.microsoft.com/office/word/2010/wordprocessingInk" xmlns:wps="http://schemas.microsoft.com/office/word/2010/wordprocessingShape" mc:Ignorable="w14 wp14">
-  <w:p>
-    <w:pPr>
-      <w:pStyle w:val="Footer"/>
-      <w:jc w:val="right"/>
-    </w:pPr>
-    <w:r>
-      <w:rPr>
-        <w:sz w:val="18"/>
-      </w:rPr>
-      <w:t xml:space="preserve">DisinfoJam   </w:t>
-    </w:r>
-    <w:fldSimple w:instr="PAGE"/>
-  </w:p>
-</w:ftr>
 </file>
 
 <file path=word/numbering.xml><?xml version="1.0" encoding="utf-8"?>
@@ -4316,7 +1226,7 @@
     <w:qFormat/>
     <w:rsid w:val="00FC693F"/>
     <w:pPr>
-      <w:spacing w:after="120" w:line="252" w:lineRule="auto"/>
+      <w:spacing w:after="100" w:line="240" w:lineRule="auto"/>
     </w:pPr>
     <w:rPr>
       <w:rFonts w:ascii="Calibri" w:hAnsi="Calibri"/>
@@ -4379,7 +1289,7 @@
     <w:pPr>
       <w:keepNext/>
       <w:keepLines/>
-      <w:spacing w:before="480" w:after="120" w:line="252" w:lineRule="auto"/>
+      <w:spacing w:before="180" w:after="80" w:line="240" w:lineRule="auto"/>
       <w:outlineLvl w:val="0"/>
     </w:pPr>
     <w:rPr>
@@ -4387,7 +1297,7 @@
       <w:b/>
       <w:bCs/>
       <w:color w:val="000000"/>
-      <w:sz w:val="40"/>
+      <w:sz w:val="24"/>
       <w:szCs w:val="28"/>
     </w:rPr>
   </w:style>
@@ -4403,14 +1313,14 @@
     <w:pPr>
       <w:keepNext/>
       <w:keepLines/>
-      <w:spacing w:before="200" w:after="100" w:line="252" w:lineRule="auto"/>
+      <w:spacing w:before="200" w:after="0"/>
       <w:outlineLvl w:val="1"/>
     </w:pPr>
     <w:rPr>
-      <w:rFonts w:asciiTheme="majorHAnsi" w:eastAsiaTheme="majorEastAsia" w:hAnsiTheme="majorHAnsi" w:cstheme="majorBidi" w:ascii="Calibri" w:hAnsi="Calibri"/>
+      <w:rFonts w:asciiTheme="majorHAnsi" w:eastAsiaTheme="majorEastAsia" w:hAnsiTheme="majorHAnsi" w:cstheme="majorBidi"/>
       <w:b/>
       <w:bCs/>
-      <w:color w:val="000000"/>
+      <w:color w:val="4F81BD" w:themeColor="accent1"/>
       <w:sz w:val="26"/>
       <w:szCs w:val="26"/>
     </w:rPr>
@@ -4665,7 +1575,7 @@
     <w:qFormat/>
     <w:rsid w:val="00FC693F"/>
     <w:pPr>
-      <w:spacing w:after="120" w:line="252" w:lineRule="auto"/>
+      <w:spacing w:after="100" w:line="240" w:lineRule="auto"/>
       <w:contextualSpacing/>
     </w:pPr>
     <w:rPr>
@@ -4673,7 +1583,7 @@
       <w:color w:val="000000"/>
       <w:spacing w:val="5"/>
       <w:kern w:val="28"/>
-      <w:sz w:val="56"/>
+      <w:sz w:val="46"/>
       <w:szCs w:val="52"/>
     </w:rPr>
   </w:style>

</xml_diff>

<commit_message>
checkpoint: before circular shift timer
</commit_message>
<xml_diff>
--- a/Docs/DisinfoJam_GDD.docx
+++ b/Docs/DisinfoJam_GDD.docx
@@ -129,8 +129,9 @@
       </w:tblPr>
       <w:tblGrid>
         <w:gridCol w:w="2448"/>
-        <w:gridCol w:w="5688"/>
-        <w:gridCol w:w="2232"/>
+        <w:gridCol w:w="4063"/>
+        <w:gridCol w:w="2136"/>
+        <w:gridCol w:w="1701"/>
       </w:tblGrid>
       <w:tr>
         <w:trPr>
@@ -167,7 +168,7 @@
         </w:tc>
         <w:tc>
           <w:tcPr>
-            <w:tcW w:w="5688" w:type="dxa"/>
+            <w:tcW w:w="4063" w:type="dxa"/>
             <w:shd w:val="clear" w:color="auto" w:fill="DDE7ED"/>
             <w:tcMar>
               <w:top w:w="70" w:type="dxa"/>
@@ -226,7 +227,31 @@
         </w:tc>
         <w:tc>
           <w:tcPr>
-            <w:tcW w:w="2232" w:type="dxa"/>
+            <w:tcW w:w="2136" w:type="dxa"/>
+            <w:shd w:val="clear" w:color="auto" w:fill="DDE7ED"/>
+          </w:tcPr>
+          <w:p>
+            <w:pPr>
+              <w:spacing w:after="0"/>
+              <w:rPr>
+                <w:b/>
+                <w:sz w:val="21"/>
+                <w:lang w:val="ru-RU"/>
+              </w:rPr>
+            </w:pPr>
+            <w:r>
+              <w:rPr>
+                <w:b/>
+                <w:sz w:val="21"/>
+                <w:lang w:val="ru-RU"/>
+              </w:rPr>
+              <w:t>Предложения</w:t>
+            </w:r>
+          </w:p>
+        </w:tc>
+        <w:tc>
+          <w:tcPr>
+            <w:tcW w:w="1701" w:type="dxa"/>
             <w:shd w:val="clear" w:color="auto" w:fill="DDE7ED"/>
             <w:tcMar>
               <w:top w:w="70" w:type="dxa"/>
@@ -308,7 +333,7 @@
         </w:tc>
         <w:tc>
           <w:tcPr>
-            <w:tcW w:w="5688" w:type="dxa"/>
+            <w:tcW w:w="4063" w:type="dxa"/>
             <w:shd w:val="clear" w:color="auto" w:fill="FFFFFF"/>
             <w:tcMar>
               <w:top w:w="70" w:type="dxa"/>
@@ -336,7 +361,22 @@
         </w:tc>
         <w:tc>
           <w:tcPr>
-            <w:tcW w:w="2232" w:type="dxa"/>
+            <w:tcW w:w="2136" w:type="dxa"/>
+            <w:shd w:val="clear" w:color="auto" w:fill="FFFFFF"/>
+          </w:tcPr>
+          <w:p>
+            <w:pPr>
+              <w:spacing w:after="0"/>
+              <w:rPr>
+                <w:sz w:val="21"/>
+                <w:lang w:val="ru-RU"/>
+              </w:rPr>
+            </w:pPr>
+          </w:p>
+        </w:tc>
+        <w:tc>
+          <w:tcPr>
+            <w:tcW w:w="1701" w:type="dxa"/>
             <w:shd w:val="clear" w:color="auto" w:fill="FFFFFF"/>
             <w:tcMar>
               <w:top w:w="70" w:type="dxa"/>
@@ -410,7 +450,7 @@
         </w:tc>
         <w:tc>
           <w:tcPr>
-            <w:tcW w:w="5688" w:type="dxa"/>
+            <w:tcW w:w="4063" w:type="dxa"/>
             <w:shd w:val="clear" w:color="auto" w:fill="FFFFFF"/>
             <w:tcMar>
               <w:top w:w="70" w:type="dxa"/>
@@ -453,20 +493,28 @@
                 <w:sz w:val="21"/>
                 <w:lang w:val="ru-RU"/>
               </w:rPr>
-              <w:t xml:space="preserve"> катсцены 4х концовок</w:t>
-            </w:r>
-            <w:r>
-              <w:rPr>
-                <w:sz w:val="21"/>
-                <w:lang w:val="ru-RU"/>
-              </w:rPr>
-              <w:t>.</w:t>
+              <w:t xml:space="preserve"> катсцены 4х концовок.</w:t>
             </w:r>
           </w:p>
         </w:tc>
         <w:tc>
           <w:tcPr>
-            <w:tcW w:w="2232" w:type="dxa"/>
+            <w:tcW w:w="2136" w:type="dxa"/>
+            <w:shd w:val="clear" w:color="auto" w:fill="FFFFFF"/>
+          </w:tcPr>
+          <w:p>
+            <w:pPr>
+              <w:spacing w:after="0"/>
+              <w:rPr>
+                <w:sz w:val="21"/>
+                <w:lang w:val="ru-RU"/>
+              </w:rPr>
+            </w:pPr>
+          </w:p>
+        </w:tc>
+        <w:tc>
+          <w:tcPr>
+            <w:tcW w:w="1701" w:type="dxa"/>
             <w:shd w:val="clear" w:color="auto" w:fill="FFFFFF"/>
             <w:tcMar>
               <w:top w:w="70" w:type="dxa"/>
@@ -488,14 +536,7 @@
                 <w:sz w:val="21"/>
                 <w:lang w:val="ru-RU"/>
               </w:rPr>
-              <w:t>Ди</w:t>
-            </w:r>
-            <w:r>
-              <w:rPr>
-                <w:sz w:val="21"/>
-                <w:lang w:val="ru-RU"/>
-              </w:rPr>
-              <w:t>ана</w:t>
+              <w:t>Диана</w:t>
             </w:r>
           </w:p>
         </w:tc>
@@ -547,7 +588,7 @@
         </w:tc>
         <w:tc>
           <w:tcPr>
-            <w:tcW w:w="5688" w:type="dxa"/>
+            <w:tcW w:w="4063" w:type="dxa"/>
             <w:shd w:val="clear" w:color="auto" w:fill="FFFFFF"/>
             <w:tcMar>
               <w:top w:w="70" w:type="dxa"/>
@@ -558,24 +599,56 @@
             <w:vAlign w:val="center"/>
           </w:tcPr>
           <w:p>
-            <w:pPr>
-              <w:spacing w:after="0"/>
+            <w:r>
               <w:rPr>
                 <w:lang w:val="ru-RU"/>
               </w:rPr>
-            </w:pPr>
+              <w:t xml:space="preserve">Просмотреть существующие статьи: каждый источник быстро читается, три заголовка дают разные решения, а объяснение результата связывает последствия с выбранными словами. Затем сыграть несколько смен: проверить, что комбо усиливает и прибыль, и штрафы; после аренды игроку приходится выбирать, потратить деньги на еду или кофе. Если игрок проигрывает в первый день, должно быть понятно, какой выбор к этому привёл. </w:t>
+            </w:r>
+            <w:proofErr w:type="spellStart"/>
             <w:r>
-              <w:rPr>
-                <w:sz w:val="21"/>
-                <w:lang w:val="ru-RU"/>
-              </w:rPr>
-              <w:t>Пройти имеющийся набор: сократить затянутые источники, объяснить штрафы, проверить комбо. Еда нужна, кофе полезен, первые ошибки не кажутся случайным наказанием.</w:t>
+              <w:t>Непонятные</w:t>
+            </w:r>
+            <w:proofErr w:type="spellEnd"/>
+            <w:r>
+              <w:t xml:space="preserve"> </w:t>
+            </w:r>
+            <w:proofErr w:type="spellStart"/>
+            <w:r>
+              <w:t>тексты</w:t>
+            </w:r>
+            <w:proofErr w:type="spellEnd"/>
+            <w:r>
+              <w:t xml:space="preserve"> и </w:t>
+            </w:r>
+            <w:proofErr w:type="spellStart"/>
+            <w:r>
+              <w:t>слишком</w:t>
+            </w:r>
+            <w:proofErr w:type="spellEnd"/>
+            <w:r>
+              <w:t xml:space="preserve"> резкие значения исправить.</w:t>
             </w:r>
           </w:p>
         </w:tc>
         <w:tc>
           <w:tcPr>
-            <w:tcW w:w="2232" w:type="dxa"/>
+            <w:tcW w:w="2136" w:type="dxa"/>
+            <w:shd w:val="clear" w:color="auto" w:fill="FFFFFF"/>
+          </w:tcPr>
+          <w:p>
+            <w:pPr>
+              <w:spacing w:after="0"/>
+              <w:rPr>
+                <w:sz w:val="21"/>
+                <w:lang w:val="ru-RU"/>
+              </w:rPr>
+            </w:pPr>
+          </w:p>
+        </w:tc>
+        <w:tc>
+          <w:tcPr>
+            <w:tcW w:w="1701" w:type="dxa"/>
             <w:shd w:val="clear" w:color="auto" w:fill="FFFFFF"/>
             <w:tcMar>
               <w:top w:w="70" w:type="dxa"/>
@@ -666,7 +739,7 @@
         </w:tc>
         <w:tc>
           <w:tcPr>
-            <w:tcW w:w="5688" w:type="dxa"/>
+            <w:tcW w:w="4063" w:type="dxa"/>
             <w:shd w:val="clear" w:color="auto" w:fill="FFFFFF"/>
             <w:tcMar>
               <w:top w:w="70" w:type="dxa"/>
@@ -723,7 +796,22 @@
         </w:tc>
         <w:tc>
           <w:tcPr>
-            <w:tcW w:w="2232" w:type="dxa"/>
+            <w:tcW w:w="2136" w:type="dxa"/>
+            <w:shd w:val="clear" w:color="auto" w:fill="FFFFFF"/>
+          </w:tcPr>
+          <w:p>
+            <w:pPr>
+              <w:spacing w:after="0"/>
+              <w:rPr>
+                <w:sz w:val="21"/>
+                <w:lang w:val="ru-RU"/>
+              </w:rPr>
+            </w:pPr>
+          </w:p>
+        </w:tc>
+        <w:tc>
+          <w:tcPr>
+            <w:tcW w:w="1701" w:type="dxa"/>
             <w:shd w:val="clear" w:color="auto" w:fill="FFFFFF"/>
             <w:tcMar>
               <w:top w:w="70" w:type="dxa"/>
@@ -783,13 +871,14 @@
                 <w:sz w:val="21"/>
                 <w:lang w:val="ru-RU"/>
               </w:rPr>
+              <w:lastRenderedPageBreak/>
               <w:t xml:space="preserve">Сделать обучение </w:t>
             </w:r>
           </w:p>
         </w:tc>
         <w:tc>
           <w:tcPr>
-            <w:tcW w:w="5688" w:type="dxa"/>
+            <w:tcW w:w="4063" w:type="dxa"/>
             <w:shd w:val="clear" w:color="auto" w:fill="FFFFFF"/>
             <w:tcMar>
               <w:top w:w="70" w:type="dxa"/>
@@ -844,14 +933,7 @@
                 <w:sz w:val="21"/>
                 <w:lang w:val="ru-RU"/>
               </w:rPr>
-              <w:t xml:space="preserve"> что где находится и за что отвечает</w:t>
-            </w:r>
-            <w:r>
-              <w:rPr>
-                <w:sz w:val="21"/>
-                <w:lang w:val="ru-RU"/>
-              </w:rPr>
-              <w:t>. Обучение происходит при нажатии на телефон на рабочем столе и с нами говорит босс. При последующих нажатиях босс просто отвечает что-то смешное и на этом все. (пока не углубляемся в механику с телефоном</w:t>
+              <w:t xml:space="preserve"> что где находится и за что отвечает. Обучение происходит при нажатии на телефон на рабочем столе и с нами говорит босс. При последующих нажатиях босс просто отвечает что-то смешное и на этом все. (пока не углубляемся в механику с телефоном</w:t>
             </w:r>
             <w:proofErr w:type="gramStart"/>
             <w:r>
@@ -859,14 +941,7 @@
                 <w:sz w:val="21"/>
                 <w:lang w:val="ru-RU"/>
               </w:rPr>
-              <w:t xml:space="preserve">) </w:t>
-            </w:r>
-            <w:r>
-              <w:rPr>
-                <w:sz w:val="21"/>
-                <w:lang w:val="ru-RU"/>
-              </w:rPr>
-              <w:t>.</w:t>
+              <w:t>) .</w:t>
             </w:r>
             <w:proofErr w:type="gramEnd"/>
             <w:r>
@@ -880,7 +955,22 @@
         </w:tc>
         <w:tc>
           <w:tcPr>
-            <w:tcW w:w="2232" w:type="dxa"/>
+            <w:tcW w:w="2136" w:type="dxa"/>
+            <w:shd w:val="clear" w:color="auto" w:fill="FFFFFF"/>
+          </w:tcPr>
+          <w:p>
+            <w:pPr>
+              <w:spacing w:after="0"/>
+              <w:rPr>
+                <w:sz w:val="21"/>
+                <w:lang w:val="ru-RU"/>
+              </w:rPr>
+            </w:pPr>
+          </w:p>
+        </w:tc>
+        <w:tc>
+          <w:tcPr>
+            <w:tcW w:w="1701" w:type="dxa"/>
             <w:shd w:val="clear" w:color="auto" w:fill="FFFFFF"/>
             <w:tcMar>
               <w:top w:w="70" w:type="dxa"/>
@@ -1002,7 +1092,7 @@
         </w:tc>
         <w:tc>
           <w:tcPr>
-            <w:tcW w:w="5688" w:type="dxa"/>
+            <w:tcW w:w="4063" w:type="dxa"/>
             <w:shd w:val="clear" w:color="auto" w:fill="FFFFFF"/>
             <w:tcMar>
               <w:top w:w="70" w:type="dxa"/>
@@ -1087,7 +1177,22 @@
         </w:tc>
         <w:tc>
           <w:tcPr>
-            <w:tcW w:w="2232" w:type="dxa"/>
+            <w:tcW w:w="2136" w:type="dxa"/>
+            <w:shd w:val="clear" w:color="auto" w:fill="FFFFFF"/>
+          </w:tcPr>
+          <w:p>
+            <w:pPr>
+              <w:spacing w:after="0"/>
+              <w:rPr>
+                <w:sz w:val="21"/>
+                <w:lang w:val="ru-RU"/>
+              </w:rPr>
+            </w:pPr>
+          </w:p>
+        </w:tc>
+        <w:tc>
+          <w:tcPr>
+            <w:tcW w:w="1701" w:type="dxa"/>
             <w:shd w:val="clear" w:color="auto" w:fill="FFFFFF"/>
             <w:tcMar>
               <w:top w:w="70" w:type="dxa"/>
@@ -1155,29 +1260,13 @@
                 <w:sz w:val="21"/>
                 <w:lang w:val="ru-RU"/>
               </w:rPr>
-              <w:t xml:space="preserve">Основной </w:t>
-            </w:r>
-            <w:proofErr w:type="spellStart"/>
-            <w:r>
-              <w:rPr>
-                <w:sz w:val="21"/>
-                <w:lang w:val="ru-RU"/>
-              </w:rPr>
-              <w:t>корлуп</w:t>
-            </w:r>
-            <w:proofErr w:type="spellEnd"/>
-            <w:r>
-              <w:rPr>
-                <w:sz w:val="21"/>
-                <w:lang w:val="ru-RU"/>
-              </w:rPr>
-              <w:t xml:space="preserve"> игры</w:t>
+              <w:t>Основной мотив игры</w:t>
             </w:r>
           </w:p>
         </w:tc>
         <w:tc>
           <w:tcPr>
-            <w:tcW w:w="5688" w:type="dxa"/>
+            <w:tcW w:w="4063" w:type="dxa"/>
             <w:shd w:val="clear" w:color="auto" w:fill="FFFFFF"/>
             <w:tcMar>
               <w:top w:w="70" w:type="dxa"/>
@@ -1200,13 +1289,58 @@
                 <w:sz w:val="21"/>
                 <w:lang w:val="ru-RU"/>
               </w:rPr>
-              <w:t>Нужно выяснить насколько процесс игры завлекает игрока, не кажется ли процесс однообразным и возможно определиться с основным мотивом продолжать играть в игру</w:t>
+              <w:t>Нужно выяснить насколько процесс игры завлекает игрока, не кажется ли процесс однообразным и возможно определиться с основным мотивом продолжать играть в игру.</w:t>
+            </w:r>
+            <w:r>
+              <w:rPr>
+                <w:sz w:val="21"/>
+                <w:lang w:val="ru-RU"/>
+              </w:rPr>
+              <w:br/>
             </w:r>
           </w:p>
         </w:tc>
         <w:tc>
           <w:tcPr>
-            <w:tcW w:w="2232" w:type="dxa"/>
+            <w:tcW w:w="2136" w:type="dxa"/>
+            <w:shd w:val="clear" w:color="auto" w:fill="FFFFFF"/>
+          </w:tcPr>
+          <w:p>
+            <w:pPr>
+              <w:spacing w:after="0"/>
+              <w:rPr>
+                <w:sz w:val="21"/>
+                <w:lang w:val="ru-RU"/>
+              </w:rPr>
+            </w:pPr>
+            <w:r>
+              <w:rPr>
+                <w:sz w:val="21"/>
+                <w:lang w:val="ru-RU"/>
+              </w:rPr>
+              <w:t xml:space="preserve">Как вариант мотивацией может выступить личная цель героини </w:t>
+            </w:r>
+            <w:proofErr w:type="gramStart"/>
+            <w:r>
+              <w:rPr>
+                <w:sz w:val="21"/>
+                <w:lang w:val="ru-RU"/>
+              </w:rPr>
+              <w:t>завершение</w:t>
+            </w:r>
+            <w:proofErr w:type="gramEnd"/>
+            <w:r>
+              <w:rPr>
+                <w:sz w:val="21"/>
+                <w:lang w:val="ru-RU"/>
+              </w:rPr>
+              <w:t xml:space="preserve"> которой можно сделать накопление средств и окончание 5 смен. Опционально можно связать дополнительно эту цель с темой борьбы с дезинформацией</w:t>
+            </w:r>
+          </w:p>
+        </w:tc>
+        <w:tc>
+          <w:tcPr>
+            <w:tcW w:w="1701" w:type="dxa"/>
             <w:shd w:val="clear" w:color="auto" w:fill="FFFFFF"/>
             <w:tcMar>
               <w:top w:w="70" w:type="dxa"/>
@@ -1246,7 +1380,6 @@
         <w:rPr>
           <w:lang w:val="ru-RU"/>
         </w:rPr>
-        <w:lastRenderedPageBreak/>
         <w:t>Следом — полезно добавить если основной цикл готов</w:t>
       </w:r>
     </w:p>
@@ -1448,6 +1581,9 @@
           <w:p>
             <w:pPr>
               <w:spacing w:after="0"/>
+              <w:rPr>
+                <w:lang w:val="ru-RU"/>
+              </w:rPr>
             </w:pPr>
             <w:r>
               <w:rPr>
@@ -1848,6 +1984,7 @@
               <w:rPr>
                 <w:sz w:val="21"/>
               </w:rPr>
+              <w:lastRenderedPageBreak/>
               <w:t>Выключение</w:t>
             </w:r>
             <w:proofErr w:type="spellEnd"/>
@@ -1929,6 +2066,131 @@
               <w:t>Эльфат</w:t>
             </w:r>
             <w:proofErr w:type="spellEnd"/>
+          </w:p>
+        </w:tc>
+      </w:tr>
+      <w:tr>
+        <w:trPr>
+          <w:cantSplit/>
+          <w:jc w:val="center"/>
+        </w:trPr>
+        <w:tc>
+          <w:tcPr>
+            <w:tcW w:w="2448" w:type="dxa"/>
+            <w:shd w:val="clear" w:color="auto" w:fill="FFFFFF"/>
+            <w:tcMar>
+              <w:top w:w="70" w:type="dxa"/>
+              <w:left w:w="70" w:type="dxa"/>
+              <w:bottom w:w="70" w:type="dxa"/>
+              <w:right w:w="70" w:type="dxa"/>
+            </w:tcMar>
+            <w:vAlign w:val="center"/>
+          </w:tcPr>
+          <w:p>
+            <w:pPr>
+              <w:spacing w:after="0"/>
+              <w:rPr>
+                <w:sz w:val="21"/>
+                <w:lang w:val="ru-RU"/>
+              </w:rPr>
+            </w:pPr>
+            <w:r>
+              <w:rPr>
+                <w:sz w:val="21"/>
+                <w:lang w:val="ru-RU"/>
+              </w:rPr>
+              <w:t xml:space="preserve">Дополнительный режим с рекордом </w:t>
+            </w:r>
+          </w:p>
+        </w:tc>
+        <w:tc>
+          <w:tcPr>
+            <w:tcW w:w="5688" w:type="dxa"/>
+            <w:shd w:val="clear" w:color="auto" w:fill="FFFFFF"/>
+            <w:tcMar>
+              <w:top w:w="70" w:type="dxa"/>
+              <w:left w:w="70" w:type="dxa"/>
+              <w:bottom w:w="70" w:type="dxa"/>
+              <w:right w:w="70" w:type="dxa"/>
+            </w:tcMar>
+            <w:vAlign w:val="center"/>
+          </w:tcPr>
+          <w:p>
+            <w:pPr>
+              <w:spacing w:after="0"/>
+              <w:rPr>
+                <w:sz w:val="21"/>
+                <w:lang w:val="ru-RU"/>
+              </w:rPr>
+            </w:pPr>
+            <w:r>
+              <w:rPr>
+                <w:sz w:val="21"/>
+                <w:lang w:val="ru-RU"/>
+              </w:rPr>
+              <w:t xml:space="preserve">Стоит добавить бесконечный режим, чтобы игрок смог попытаться побить собственный рекорд. (Взять предложенную </w:t>
+            </w:r>
+            <w:proofErr w:type="spellStart"/>
+            <w:r>
+              <w:rPr>
+                <w:sz w:val="21"/>
+                <w:lang w:val="ru-RU"/>
+              </w:rPr>
+              <w:t>Снежой</w:t>
+            </w:r>
+            <w:proofErr w:type="spellEnd"/>
+            <w:r>
+              <w:rPr>
+                <w:sz w:val="21"/>
+                <w:lang w:val="ru-RU"/>
+              </w:rPr>
+              <w:t xml:space="preserve"> механику ввода имени перед игрой)</w:t>
+            </w:r>
+          </w:p>
+        </w:tc>
+        <w:tc>
+          <w:tcPr>
+            <w:tcW w:w="2232" w:type="dxa"/>
+            <w:shd w:val="clear" w:color="auto" w:fill="FFFFFF"/>
+            <w:tcMar>
+              <w:top w:w="70" w:type="dxa"/>
+              <w:left w:w="70" w:type="dxa"/>
+              <w:bottom w:w="70" w:type="dxa"/>
+              <w:right w:w="70" w:type="dxa"/>
+            </w:tcMar>
+            <w:vAlign w:val="center"/>
+          </w:tcPr>
+          <w:p>
+            <w:pPr>
+              <w:spacing w:after="0"/>
+              <w:rPr>
+                <w:sz w:val="21"/>
+                <w:lang w:val="ru-RU"/>
+              </w:rPr>
+            </w:pPr>
+            <w:r>
+              <w:rPr>
+                <w:sz w:val="21"/>
+                <w:lang w:val="ru-RU"/>
+              </w:rPr>
+              <w:t xml:space="preserve">Да </w:t>
+            </w:r>
+            <w:proofErr w:type="spellStart"/>
+            <w:r>
+              <w:rPr>
+                <w:sz w:val="21"/>
+                <w:lang w:val="ru-RU"/>
+              </w:rPr>
+              <w:t>хз</w:t>
+            </w:r>
+            <w:proofErr w:type="spellEnd"/>
+            <w:r>
+              <w:rPr>
+                <w:sz w:val="21"/>
+                <w:lang w:val="ru-RU"/>
+              </w:rPr>
+              <w:t xml:space="preserve"> уже </w:t>
+            </w:r>
           </w:p>
         </w:tc>
       </w:tr>

</xml_diff>